<commit_message>
Amended branding of league page, added logo and consitution links, updated docs with version control
</commit_message>
<xml_diff>
--- a/docs/Club-Solutions-Club-Constitution-Template.docx
+++ b/docs/Club-Solutions-Club-Constitution-Template.docx
@@ -2,16 +2,754 @@
 <file path=word/document.xml><?xml version="1.0" encoding="utf-8"?>
 <w:document xmlns:wpc="http://schemas.microsoft.com/office/word/2010/wordprocessingCanvas" xmlns:cx="http://schemas.microsoft.com/office/drawing/2014/chartex" xmlns:cx1="http://schemas.microsoft.com/office/drawing/2015/9/8/chartex" xmlns:cx2="http://schemas.microsoft.com/office/drawing/2015/10/21/chartex" xmlns:cx3="http://schemas.microsoft.com/office/drawing/2016/5/9/chartex" xmlns:cx4="http://schemas.microsoft.com/office/drawing/2016/5/10/chartex" xmlns:cx5="http://schemas.microsoft.com/office/drawing/2016/5/11/chartex" xmlns:cx6="http://schemas.microsoft.com/office/drawing/2016/5/12/chartex" xmlns:cx7="http://schemas.microsoft.com/office/drawing/2016/5/13/chartex" xmlns:cx8="http://schemas.microsoft.com/office/drawing/2016/5/14/chartex" xmlns:mc="http://schemas.openxmlformats.org/markup-compatibility/2006" xmlns:aink="http://schemas.microsoft.com/office/drawing/2016/ink" xmlns:am3d="http://schemas.microsoft.com/office/drawing/2017/model3d" xmlns:o="urn:schemas-microsoft-com:office:office" xmlns:oel="http://schemas.microsoft.com/office/2019/extlst" xmlns:r="http://schemas.openxmlformats.org/officeDocument/2006/relationships" xmlns:m="http://schemas.openxmlformats.org/officeDocument/2006/math" xmlns:v="urn:schemas-microsoft-com:vml" xmlns:wp14="http://schemas.microsoft.com/office/word/2010/wordprocessingDrawing" xmlns:wp="http://schemas.openxmlformats.org/drawingml/2006/wordprocessingDrawing" xmlns:w10="urn:schemas-microsoft-com:office:word" xmlns:w="http://schemas.openxmlformats.org/wordprocessingml/2006/main" xmlns:w14="http://schemas.microsoft.com/office/word/2010/wordml" xmlns:w15="http://schemas.microsoft.com/office/word/2012/wordml" xmlns:w16cex="http://schemas.microsoft.com/office/word/2018/wordml/cex" xmlns:w16cid="http://schemas.microsoft.com/office/word/2016/wordml/cid" xmlns:w16="http://schemas.microsoft.com/office/word/2018/wordml" xmlns:w16du="http://schemas.microsoft.com/office/word/2023/wordml/word16du" xmlns:w16sdtdh="http://schemas.microsoft.com/office/word/2020/wordml/sdtdatahash" xmlns:w16sdtfl="http://schemas.microsoft.com/office/word/2024/wordml/sdtformatlock" xmlns:w16se="http://schemas.microsoft.com/office/word/2015/wordml/symex" xmlns:wpg="http://schemas.microsoft.com/office/word/2010/wordprocessingGroup" xmlns:wpi="http://schemas.microsoft.com/office/word/2010/wordprocessingInk" xmlns:wne="http://schemas.microsoft.com/office/word/2006/wordml" xmlns:wps="http://schemas.microsoft.com/office/word/2010/wordprocessingShape" mc:Ignorable="w14 w15 w16se w16cid w16 w16cex w16sdtdh w16sdtfl w16du wp14">
   <w:body>
-    <w:p>
-      <w:pPr>
-        <w:spacing w:line="259" w:lineRule="auto"/>
-        <w:ind w:left="115" w:firstLine="0"/>
-      </w:pPr>
-      <w:r>
+    <w:tbl>
+      <w:tblPr>
+        <w:tblStyle w:val="GridTable4-Accent4"/>
+        <w:tblW w:w="0" w:type="auto"/>
+        <w:tblLook w:val="04A0" w:firstRow="1" w:lastRow="0" w:firstColumn="1" w:lastColumn="0" w:noHBand="0" w:noVBand="1"/>
+      </w:tblPr>
+      <w:tblGrid>
+        <w:gridCol w:w="1109"/>
+        <w:gridCol w:w="1425"/>
+        <w:gridCol w:w="1760"/>
+        <w:gridCol w:w="2439"/>
+        <w:gridCol w:w="1677"/>
+      </w:tblGrid>
+      <w:tr>
+        <w:trPr>
+          <w:cnfStyle w:val="100000000000" w:firstRow="1" w:lastRow="0" w:firstColumn="0" w:lastColumn="0" w:oddVBand="0" w:evenVBand="0" w:oddHBand="0" w:evenHBand="0" w:firstRowFirstColumn="0" w:firstRowLastColumn="0" w:lastRowFirstColumn="0" w:lastRowLastColumn="0"/>
+        </w:trPr>
+        <w:tc>
+          <w:tcPr>
+            <w:cnfStyle w:val="001000000000" w:firstRow="0" w:lastRow="0" w:firstColumn="1" w:lastColumn="0" w:oddVBand="0" w:evenVBand="0" w:oddHBand="0" w:evenHBand="0" w:firstRowFirstColumn="0" w:firstRowLastColumn="0" w:lastRowFirstColumn="0" w:lastRowLastColumn="0"/>
+            <w:tcW w:w="0" w:type="auto"/>
+            <w:hideMark/>
+          </w:tcPr>
+          <w:p>
+            <w:pPr>
+              <w:spacing w:line="259" w:lineRule="auto"/>
+              <w:ind w:left="115" w:firstLine="0"/>
+              <w:rPr>
+                <w:rFonts w:ascii="Times New Roman" w:eastAsia="Times New Roman" w:hAnsi="Times New Roman" w:cs="Times New Roman"/>
+              </w:rPr>
+            </w:pPr>
+            <w:r>
+              <w:rPr>
+                <w:rFonts w:ascii="Times New Roman" w:eastAsia="Times New Roman" w:hAnsi="Times New Roman" w:cs="Times New Roman"/>
+              </w:rPr>
+              <w:t>Version</w:t>
+            </w:r>
+          </w:p>
+        </w:tc>
+        <w:tc>
+          <w:tcPr>
+            <w:tcW w:w="0" w:type="auto"/>
+            <w:hideMark/>
+          </w:tcPr>
+          <w:p>
+            <w:pPr>
+              <w:spacing w:line="259" w:lineRule="auto"/>
+              <w:ind w:left="115" w:firstLine="0"/>
+              <w:cnfStyle w:val="100000000000" w:firstRow="1" w:lastRow="0" w:firstColumn="0" w:lastColumn="0" w:oddVBand="0" w:evenVBand="0" w:oddHBand="0" w:evenHBand="0" w:firstRowFirstColumn="0" w:firstRowLastColumn="0" w:lastRowFirstColumn="0" w:lastRowLastColumn="0"/>
+              <w:rPr>
+                <w:rFonts w:ascii="Times New Roman" w:eastAsia="Times New Roman" w:hAnsi="Times New Roman" w:cs="Times New Roman"/>
+              </w:rPr>
+            </w:pPr>
+            <w:r>
+              <w:rPr>
+                <w:rFonts w:ascii="Times New Roman" w:eastAsia="Times New Roman" w:hAnsi="Times New Roman" w:cs="Times New Roman"/>
+              </w:rPr>
+              <w:t>Date</w:t>
+            </w:r>
+          </w:p>
+        </w:tc>
+        <w:tc>
+          <w:tcPr>
+            <w:tcW w:w="0" w:type="auto"/>
+            <w:hideMark/>
+          </w:tcPr>
+          <w:p>
+            <w:pPr>
+              <w:spacing w:line="259" w:lineRule="auto"/>
+              <w:ind w:left="115" w:firstLine="0"/>
+              <w:cnfStyle w:val="100000000000" w:firstRow="1" w:lastRow="0" w:firstColumn="0" w:lastColumn="0" w:oddVBand="0" w:evenVBand="0" w:oddHBand="0" w:evenHBand="0" w:firstRowFirstColumn="0" w:firstRowLastColumn="0" w:lastRowFirstColumn="0" w:lastRowLastColumn="0"/>
+              <w:rPr>
+                <w:rFonts w:ascii="Times New Roman" w:eastAsia="Times New Roman" w:hAnsi="Times New Roman" w:cs="Times New Roman"/>
+              </w:rPr>
+            </w:pPr>
+            <w:r>
+              <w:rPr>
+                <w:rFonts w:ascii="Times New Roman" w:eastAsia="Times New Roman" w:hAnsi="Times New Roman" w:cs="Times New Roman"/>
+              </w:rPr>
+              <w:t>Author / Modifier</w:t>
+            </w:r>
+          </w:p>
+        </w:tc>
+        <w:tc>
+          <w:tcPr>
+            <w:tcW w:w="0" w:type="auto"/>
+            <w:hideMark/>
+          </w:tcPr>
+          <w:p>
+            <w:pPr>
+              <w:spacing w:line="259" w:lineRule="auto"/>
+              <w:ind w:left="115" w:firstLine="0"/>
+              <w:cnfStyle w:val="100000000000" w:firstRow="1" w:lastRow="0" w:firstColumn="0" w:lastColumn="0" w:oddVBand="0" w:evenVBand="0" w:oddHBand="0" w:evenHBand="0" w:firstRowFirstColumn="0" w:firstRowLastColumn="0" w:lastRowFirstColumn="0" w:lastRowLastColumn="0"/>
+              <w:rPr>
+                <w:rFonts w:ascii="Times New Roman" w:eastAsia="Times New Roman" w:hAnsi="Times New Roman" w:cs="Times New Roman"/>
+              </w:rPr>
+            </w:pPr>
+            <w:r>
+              <w:rPr>
+                <w:rFonts w:ascii="Times New Roman" w:eastAsia="Times New Roman" w:hAnsi="Times New Roman" w:cs="Times New Roman"/>
+              </w:rPr>
+              <w:t>Description of Changes</w:t>
+            </w:r>
+          </w:p>
+        </w:tc>
+        <w:tc>
+          <w:tcPr>
+            <w:tcW w:w="0" w:type="auto"/>
+            <w:hideMark/>
+          </w:tcPr>
+          <w:p>
+            <w:pPr>
+              <w:spacing w:line="259" w:lineRule="auto"/>
+              <w:ind w:left="115" w:firstLine="0"/>
+              <w:cnfStyle w:val="100000000000" w:firstRow="1" w:lastRow="0" w:firstColumn="0" w:lastColumn="0" w:oddVBand="0" w:evenVBand="0" w:oddHBand="0" w:evenHBand="0" w:firstRowFirstColumn="0" w:firstRowLastColumn="0" w:lastRowFirstColumn="0" w:lastRowLastColumn="0"/>
+              <w:rPr>
+                <w:rFonts w:ascii="Times New Roman" w:eastAsia="Times New Roman" w:hAnsi="Times New Roman" w:cs="Times New Roman"/>
+              </w:rPr>
+            </w:pPr>
+            <w:r>
+              <w:rPr>
+                <w:rFonts w:ascii="Times New Roman" w:eastAsia="Times New Roman" w:hAnsi="Times New Roman" w:cs="Times New Roman"/>
+              </w:rPr>
+              <w:t>Approved By</w:t>
+            </w:r>
+          </w:p>
+        </w:tc>
+      </w:tr>
+      <w:tr>
+        <w:trPr>
+          <w:cnfStyle w:val="000000100000" w:firstRow="0" w:lastRow="0" w:firstColumn="0" w:lastColumn="0" w:oddVBand="0" w:evenVBand="0" w:oddHBand="1" w:evenHBand="0" w:firstRowFirstColumn="0" w:firstRowLastColumn="0" w:lastRowFirstColumn="0" w:lastRowLastColumn="0"/>
+        </w:trPr>
+        <w:tc>
+          <w:tcPr>
+            <w:cnfStyle w:val="001000000000" w:firstRow="0" w:lastRow="0" w:firstColumn="1" w:lastColumn="0" w:oddVBand="0" w:evenVBand="0" w:oddHBand="0" w:evenHBand="0" w:firstRowFirstColumn="0" w:firstRowLastColumn="0" w:lastRowFirstColumn="0" w:lastRowLastColumn="0"/>
+            <w:tcW w:w="0" w:type="auto"/>
+            <w:tcBorders>
+              <w:top w:val="single" w:sz="4" w:space="0" w:color="60CAF3" w:themeColor="accent4" w:themeTint="99"/>
+              <w:left w:val="single" w:sz="4" w:space="0" w:color="60CAF3" w:themeColor="accent4" w:themeTint="99"/>
+              <w:bottom w:val="single" w:sz="4" w:space="0" w:color="60CAF3" w:themeColor="accent4" w:themeTint="99"/>
+              <w:right w:val="single" w:sz="4" w:space="0" w:color="60CAF3" w:themeColor="accent4" w:themeTint="99"/>
+            </w:tcBorders>
+            <w:hideMark/>
+          </w:tcPr>
+          <w:p>
+            <w:pPr>
+              <w:spacing w:line="259" w:lineRule="auto"/>
+              <w:ind w:left="115" w:firstLine="0"/>
+              <w:rPr>
+                <w:rFonts w:ascii="Times New Roman" w:eastAsia="Times New Roman" w:hAnsi="Times New Roman" w:cs="Times New Roman"/>
+              </w:rPr>
+            </w:pPr>
+            <w:r>
+              <w:rPr>
+                <w:rFonts w:ascii="Times New Roman" w:eastAsia="Times New Roman" w:hAnsi="Times New Roman" w:cs="Times New Roman"/>
+              </w:rPr>
+              <w:t>1.0</w:t>
+            </w:r>
+          </w:p>
+        </w:tc>
+        <w:tc>
+          <w:tcPr>
+            <w:tcW w:w="0" w:type="auto"/>
+            <w:tcBorders>
+              <w:top w:val="single" w:sz="4" w:space="0" w:color="60CAF3" w:themeColor="accent4" w:themeTint="99"/>
+              <w:left w:val="single" w:sz="4" w:space="0" w:color="60CAF3" w:themeColor="accent4" w:themeTint="99"/>
+              <w:bottom w:val="single" w:sz="4" w:space="0" w:color="60CAF3" w:themeColor="accent4" w:themeTint="99"/>
+              <w:right w:val="single" w:sz="4" w:space="0" w:color="60CAF3" w:themeColor="accent4" w:themeTint="99"/>
+            </w:tcBorders>
+            <w:hideMark/>
+          </w:tcPr>
+          <w:p>
+            <w:pPr>
+              <w:spacing w:line="259" w:lineRule="auto"/>
+              <w:ind w:left="115" w:firstLine="0"/>
+              <w:cnfStyle w:val="000000100000" w:firstRow="0" w:lastRow="0" w:firstColumn="0" w:lastColumn="0" w:oddVBand="0" w:evenVBand="0" w:oddHBand="1" w:evenHBand="0" w:firstRowFirstColumn="0" w:firstRowLastColumn="0" w:lastRowFirstColumn="0" w:lastRowLastColumn="0"/>
+              <w:rPr>
+                <w:rFonts w:ascii="Times New Roman" w:eastAsia="Times New Roman" w:hAnsi="Times New Roman" w:cs="Times New Roman"/>
+                <w:b/>
+                <w:bCs/>
+              </w:rPr>
+            </w:pPr>
+            <w:r>
+              <w:rPr>
+                <w:rFonts w:ascii="Times New Roman" w:eastAsia="Times New Roman" w:hAnsi="Times New Roman" w:cs="Times New Roman"/>
+                <w:b/>
+                <w:bCs/>
+              </w:rPr>
+              <w:t>01</w:t>
+            </w:r>
+            <w:r>
+              <w:rPr>
+                <w:rFonts w:ascii="Times New Roman" w:eastAsia="Times New Roman" w:hAnsi="Times New Roman" w:cs="Times New Roman"/>
+                <w:b/>
+                <w:bCs/>
+              </w:rPr>
+              <w:t>/0</w:t>
+            </w:r>
+            <w:r>
+              <w:rPr>
+                <w:rFonts w:ascii="Times New Roman" w:eastAsia="Times New Roman" w:hAnsi="Times New Roman" w:cs="Times New Roman"/>
+                <w:b/>
+                <w:bCs/>
+              </w:rPr>
+              <w:t>1</w:t>
+            </w:r>
+            <w:r>
+              <w:rPr>
+                <w:rFonts w:ascii="Times New Roman" w:eastAsia="Times New Roman" w:hAnsi="Times New Roman" w:cs="Times New Roman"/>
+                <w:b/>
+                <w:bCs/>
+              </w:rPr>
+              <w:t>/2026</w:t>
+            </w:r>
+          </w:p>
+        </w:tc>
+        <w:tc>
+          <w:tcPr>
+            <w:tcW w:w="0" w:type="auto"/>
+            <w:tcBorders>
+              <w:top w:val="single" w:sz="4" w:space="0" w:color="60CAF3" w:themeColor="accent4" w:themeTint="99"/>
+              <w:left w:val="single" w:sz="4" w:space="0" w:color="60CAF3" w:themeColor="accent4" w:themeTint="99"/>
+              <w:bottom w:val="single" w:sz="4" w:space="0" w:color="60CAF3" w:themeColor="accent4" w:themeTint="99"/>
+              <w:right w:val="single" w:sz="4" w:space="0" w:color="60CAF3" w:themeColor="accent4" w:themeTint="99"/>
+            </w:tcBorders>
+            <w:hideMark/>
+          </w:tcPr>
+          <w:p>
+            <w:pPr>
+              <w:spacing w:line="259" w:lineRule="auto"/>
+              <w:ind w:left="115" w:firstLine="0"/>
+              <w:cnfStyle w:val="000000100000" w:firstRow="0" w:lastRow="0" w:firstColumn="0" w:lastColumn="0" w:oddVBand="0" w:evenVBand="0" w:oddHBand="1" w:evenHBand="0" w:firstRowFirstColumn="0" w:firstRowLastColumn="0" w:lastRowFirstColumn="0" w:lastRowLastColumn="0"/>
+              <w:rPr>
+                <w:rFonts w:ascii="Times New Roman" w:eastAsia="Times New Roman" w:hAnsi="Times New Roman" w:cs="Times New Roman"/>
+                <w:b/>
+                <w:bCs/>
+              </w:rPr>
+            </w:pPr>
+            <w:r>
+              <w:rPr>
+                <w:rFonts w:ascii="Times New Roman" w:eastAsia="Times New Roman" w:hAnsi="Times New Roman" w:cs="Times New Roman"/>
+                <w:b/>
+                <w:bCs/>
+              </w:rPr>
+              <w:t>Board of Directors</w:t>
+            </w:r>
+          </w:p>
+        </w:tc>
+        <w:tc>
+          <w:tcPr>
+            <w:tcW w:w="0" w:type="auto"/>
+            <w:tcBorders>
+              <w:top w:val="single" w:sz="4" w:space="0" w:color="60CAF3" w:themeColor="accent4" w:themeTint="99"/>
+              <w:left w:val="single" w:sz="4" w:space="0" w:color="60CAF3" w:themeColor="accent4" w:themeTint="99"/>
+              <w:bottom w:val="single" w:sz="4" w:space="0" w:color="60CAF3" w:themeColor="accent4" w:themeTint="99"/>
+              <w:right w:val="single" w:sz="4" w:space="0" w:color="60CAF3" w:themeColor="accent4" w:themeTint="99"/>
+            </w:tcBorders>
+            <w:hideMark/>
+          </w:tcPr>
+          <w:p>
+            <w:pPr>
+              <w:spacing w:line="259" w:lineRule="auto"/>
+              <w:ind w:left="115" w:firstLine="0"/>
+              <w:cnfStyle w:val="000000100000" w:firstRow="0" w:lastRow="0" w:firstColumn="0" w:lastColumn="0" w:oddVBand="0" w:evenVBand="0" w:oddHBand="1" w:evenHBand="0" w:firstRowFirstColumn="0" w:firstRowLastColumn="0" w:lastRowFirstColumn="0" w:lastRowLastColumn="0"/>
+              <w:rPr>
+                <w:rFonts w:ascii="Times New Roman" w:eastAsia="Times New Roman" w:hAnsi="Times New Roman" w:cs="Times New Roman"/>
+                <w:b/>
+                <w:bCs/>
+              </w:rPr>
+            </w:pPr>
+            <w:r>
+              <w:rPr>
+                <w:rFonts w:ascii="Times New Roman" w:eastAsia="Times New Roman" w:hAnsi="Times New Roman" w:cs="Times New Roman"/>
+                <w:b/>
+                <w:bCs/>
+              </w:rPr>
+              <w:t>First official release for the 2026 season.</w:t>
+            </w:r>
+          </w:p>
+        </w:tc>
+        <w:tc>
+          <w:tcPr>
+            <w:tcW w:w="0" w:type="auto"/>
+            <w:tcBorders>
+              <w:top w:val="single" w:sz="4" w:space="0" w:color="60CAF3" w:themeColor="accent4" w:themeTint="99"/>
+              <w:left w:val="single" w:sz="4" w:space="0" w:color="60CAF3" w:themeColor="accent4" w:themeTint="99"/>
+              <w:bottom w:val="single" w:sz="4" w:space="0" w:color="60CAF3" w:themeColor="accent4" w:themeTint="99"/>
+              <w:right w:val="single" w:sz="4" w:space="0" w:color="60CAF3" w:themeColor="accent4" w:themeTint="99"/>
+            </w:tcBorders>
+            <w:hideMark/>
+          </w:tcPr>
+          <w:p>
+            <w:pPr>
+              <w:spacing w:line="259" w:lineRule="auto"/>
+              <w:ind w:left="115" w:firstLine="0"/>
+              <w:cnfStyle w:val="000000100000" w:firstRow="0" w:lastRow="0" w:firstColumn="0" w:lastColumn="0" w:oddVBand="0" w:evenVBand="0" w:oddHBand="1" w:evenHBand="0" w:firstRowFirstColumn="0" w:firstRowLastColumn="0" w:lastRowFirstColumn="0" w:lastRowLastColumn="0"/>
+              <w:rPr>
+                <w:rFonts w:ascii="Times New Roman" w:eastAsia="Times New Roman" w:hAnsi="Times New Roman" w:cs="Times New Roman"/>
+                <w:b/>
+                <w:bCs/>
+              </w:rPr>
+            </w:pPr>
+            <w:r>
+              <w:rPr>
+                <w:rFonts w:ascii="Times New Roman" w:eastAsia="Times New Roman" w:hAnsi="Times New Roman" w:cs="Times New Roman"/>
+                <w:b/>
+                <w:bCs/>
+              </w:rPr>
+              <w:t>Club President</w:t>
+            </w:r>
+          </w:p>
+        </w:tc>
+      </w:tr>
+      <w:tr>
+        <w:tc>
+          <w:tcPr>
+            <w:cnfStyle w:val="001000000000" w:firstRow="0" w:lastRow="0" w:firstColumn="1" w:lastColumn="0" w:oddVBand="0" w:evenVBand="0" w:oddHBand="0" w:evenHBand="0" w:firstRowFirstColumn="0" w:firstRowLastColumn="0" w:lastRowFirstColumn="0" w:lastRowLastColumn="0"/>
+            <w:tcW w:w="0" w:type="auto"/>
+            <w:tcBorders>
+              <w:top w:val="single" w:sz="4" w:space="0" w:color="60CAF3" w:themeColor="accent4" w:themeTint="99"/>
+              <w:left w:val="single" w:sz="4" w:space="0" w:color="60CAF3" w:themeColor="accent4" w:themeTint="99"/>
+              <w:bottom w:val="single" w:sz="4" w:space="0" w:color="60CAF3" w:themeColor="accent4" w:themeTint="99"/>
+              <w:right w:val="single" w:sz="4" w:space="0" w:color="60CAF3" w:themeColor="accent4" w:themeTint="99"/>
+            </w:tcBorders>
+            <w:hideMark/>
+          </w:tcPr>
+          <w:p>
+            <w:pPr>
+              <w:spacing w:line="259" w:lineRule="auto"/>
+              <w:ind w:left="115" w:firstLine="0"/>
+              <w:rPr>
+                <w:rFonts w:ascii="Times New Roman" w:eastAsia="Times New Roman" w:hAnsi="Times New Roman" w:cs="Times New Roman"/>
+              </w:rPr>
+            </w:pPr>
+            <w:r>
+              <w:rPr>
+                <w:rFonts w:ascii="Times New Roman" w:eastAsia="Times New Roman" w:hAnsi="Times New Roman" w:cs="Times New Roman"/>
+              </w:rPr>
+              <w:t>1.1</w:t>
+            </w:r>
+          </w:p>
+        </w:tc>
+        <w:tc>
+          <w:tcPr>
+            <w:tcW w:w="0" w:type="auto"/>
+            <w:tcBorders>
+              <w:top w:val="single" w:sz="4" w:space="0" w:color="60CAF3" w:themeColor="accent4" w:themeTint="99"/>
+              <w:left w:val="single" w:sz="4" w:space="0" w:color="60CAF3" w:themeColor="accent4" w:themeTint="99"/>
+              <w:bottom w:val="single" w:sz="4" w:space="0" w:color="60CAF3" w:themeColor="accent4" w:themeTint="99"/>
+              <w:right w:val="single" w:sz="4" w:space="0" w:color="60CAF3" w:themeColor="accent4" w:themeTint="99"/>
+            </w:tcBorders>
+            <w:hideMark/>
+          </w:tcPr>
+          <w:p>
+            <w:pPr>
+              <w:spacing w:line="259" w:lineRule="auto"/>
+              <w:ind w:left="115" w:firstLine="0"/>
+              <w:cnfStyle w:val="000000000000" w:firstRow="0" w:lastRow="0" w:firstColumn="0" w:lastColumn="0" w:oddVBand="0" w:evenVBand="0" w:oddHBand="0" w:evenHBand="0" w:firstRowFirstColumn="0" w:firstRowLastColumn="0" w:lastRowFirstColumn="0" w:lastRowLastColumn="0"/>
+              <w:rPr>
+                <w:rFonts w:ascii="Times New Roman" w:eastAsia="Times New Roman" w:hAnsi="Times New Roman" w:cs="Times New Roman"/>
+                <w:b/>
+                <w:bCs/>
+              </w:rPr>
+            </w:pPr>
+            <w:r>
+              <w:rPr>
+                <w:rFonts w:ascii="Times New Roman" w:eastAsia="Times New Roman" w:hAnsi="Times New Roman" w:cs="Times New Roman"/>
+                <w:b/>
+                <w:bCs/>
+              </w:rPr>
+              <w:t>[Date]</w:t>
+            </w:r>
+          </w:p>
+        </w:tc>
+        <w:tc>
+          <w:tcPr>
+            <w:tcW w:w="0" w:type="auto"/>
+            <w:tcBorders>
+              <w:top w:val="single" w:sz="4" w:space="0" w:color="60CAF3" w:themeColor="accent4" w:themeTint="99"/>
+              <w:left w:val="single" w:sz="4" w:space="0" w:color="60CAF3" w:themeColor="accent4" w:themeTint="99"/>
+              <w:bottom w:val="single" w:sz="4" w:space="0" w:color="60CAF3" w:themeColor="accent4" w:themeTint="99"/>
+              <w:right w:val="single" w:sz="4" w:space="0" w:color="60CAF3" w:themeColor="accent4" w:themeTint="99"/>
+            </w:tcBorders>
+            <w:hideMark/>
+          </w:tcPr>
+          <w:p>
+            <w:pPr>
+              <w:spacing w:line="259" w:lineRule="auto"/>
+              <w:ind w:left="115" w:firstLine="0"/>
+              <w:cnfStyle w:val="000000000000" w:firstRow="0" w:lastRow="0" w:firstColumn="0" w:lastColumn="0" w:oddVBand="0" w:evenVBand="0" w:oddHBand="0" w:evenHBand="0" w:firstRowFirstColumn="0" w:firstRowLastColumn="0" w:lastRowFirstColumn="0" w:lastRowLastColumn="0"/>
+              <w:rPr>
+                <w:rFonts w:ascii="Times New Roman" w:eastAsia="Times New Roman" w:hAnsi="Times New Roman" w:cs="Times New Roman"/>
+                <w:b/>
+                <w:bCs/>
+              </w:rPr>
+            </w:pPr>
+            <w:r>
+              <w:rPr>
+                <w:rFonts w:ascii="Times New Roman" w:eastAsia="Times New Roman" w:hAnsi="Times New Roman" w:cs="Times New Roman"/>
+                <w:b/>
+                <w:bCs/>
+              </w:rPr>
+              <w:t>[Name/Role]</w:t>
+            </w:r>
+          </w:p>
+        </w:tc>
+        <w:tc>
+          <w:tcPr>
+            <w:tcW w:w="0" w:type="auto"/>
+            <w:tcBorders>
+              <w:top w:val="single" w:sz="4" w:space="0" w:color="60CAF3" w:themeColor="accent4" w:themeTint="99"/>
+              <w:left w:val="single" w:sz="4" w:space="0" w:color="60CAF3" w:themeColor="accent4" w:themeTint="99"/>
+              <w:bottom w:val="single" w:sz="4" w:space="0" w:color="60CAF3" w:themeColor="accent4" w:themeTint="99"/>
+              <w:right w:val="single" w:sz="4" w:space="0" w:color="60CAF3" w:themeColor="accent4" w:themeTint="99"/>
+            </w:tcBorders>
+            <w:hideMark/>
+          </w:tcPr>
+          <w:p>
+            <w:pPr>
+              <w:spacing w:line="259" w:lineRule="auto"/>
+              <w:ind w:left="115" w:firstLine="0"/>
+              <w:cnfStyle w:val="000000000000" w:firstRow="0" w:lastRow="0" w:firstColumn="0" w:lastColumn="0" w:oddVBand="0" w:evenVBand="0" w:oddHBand="0" w:evenHBand="0" w:firstRowFirstColumn="0" w:firstRowLastColumn="0" w:lastRowFirstColumn="0" w:lastRowLastColumn="0"/>
+              <w:rPr>
+                <w:rFonts w:ascii="Times New Roman" w:eastAsia="Times New Roman" w:hAnsi="Times New Roman" w:cs="Times New Roman"/>
+                <w:b/>
+                <w:bCs/>
+              </w:rPr>
+            </w:pPr>
+            <w:r>
+              <w:rPr>
+                <w:rFonts w:ascii="Times New Roman" w:eastAsia="Times New Roman" w:hAnsi="Times New Roman" w:cs="Times New Roman"/>
+                <w:b/>
+                <w:bCs/>
+              </w:rPr>
+              <w:t>Added specific clause regarding outdoor noise hours.</w:t>
+            </w:r>
+          </w:p>
+        </w:tc>
+        <w:tc>
+          <w:tcPr>
+            <w:tcW w:w="0" w:type="auto"/>
+            <w:tcBorders>
+              <w:top w:val="single" w:sz="4" w:space="0" w:color="60CAF3" w:themeColor="accent4" w:themeTint="99"/>
+              <w:left w:val="single" w:sz="4" w:space="0" w:color="60CAF3" w:themeColor="accent4" w:themeTint="99"/>
+              <w:bottom w:val="single" w:sz="4" w:space="0" w:color="60CAF3" w:themeColor="accent4" w:themeTint="99"/>
+              <w:right w:val="single" w:sz="4" w:space="0" w:color="60CAF3" w:themeColor="accent4" w:themeTint="99"/>
+            </w:tcBorders>
+            <w:hideMark/>
+          </w:tcPr>
+          <w:p>
+            <w:pPr>
+              <w:spacing w:line="259" w:lineRule="auto"/>
+              <w:ind w:left="115" w:firstLine="0"/>
+              <w:cnfStyle w:val="000000000000" w:firstRow="0" w:lastRow="0" w:firstColumn="0" w:lastColumn="0" w:oddVBand="0" w:evenVBand="0" w:oddHBand="0" w:evenHBand="0" w:firstRowFirstColumn="0" w:firstRowLastColumn="0" w:lastRowFirstColumn="0" w:lastRowLastColumn="0"/>
+              <w:rPr>
+                <w:rFonts w:ascii="Times New Roman" w:eastAsia="Times New Roman" w:hAnsi="Times New Roman" w:cs="Times New Roman"/>
+                <w:b/>
+                <w:bCs/>
+              </w:rPr>
+            </w:pPr>
+            <w:r>
+              <w:rPr>
+                <w:rFonts w:ascii="Times New Roman" w:eastAsia="Times New Roman" w:hAnsi="Times New Roman" w:cs="Times New Roman"/>
+                <w:b/>
+                <w:bCs/>
+              </w:rPr>
+              <w:t>[Name/Role]</w:t>
+            </w:r>
+          </w:p>
+        </w:tc>
+      </w:tr>
+      <w:tr>
+        <w:trPr>
+          <w:cnfStyle w:val="000000100000" w:firstRow="0" w:lastRow="0" w:firstColumn="0" w:lastColumn="0" w:oddVBand="0" w:evenVBand="0" w:oddHBand="1" w:evenHBand="0" w:firstRowFirstColumn="0" w:firstRowLastColumn="0" w:lastRowFirstColumn="0" w:lastRowLastColumn="0"/>
+        </w:trPr>
+        <w:tc>
+          <w:tcPr>
+            <w:cnfStyle w:val="001000000000" w:firstRow="0" w:lastRow="0" w:firstColumn="1" w:lastColumn="0" w:oddVBand="0" w:evenVBand="0" w:oddHBand="0" w:evenHBand="0" w:firstRowFirstColumn="0" w:firstRowLastColumn="0" w:lastRowFirstColumn="0" w:lastRowLastColumn="0"/>
+            <w:tcW w:w="0" w:type="auto"/>
+            <w:tcBorders>
+              <w:top w:val="single" w:sz="4" w:space="0" w:color="60CAF3" w:themeColor="accent4" w:themeTint="99"/>
+              <w:left w:val="single" w:sz="4" w:space="0" w:color="60CAF3" w:themeColor="accent4" w:themeTint="99"/>
+              <w:bottom w:val="single" w:sz="4" w:space="0" w:color="60CAF3" w:themeColor="accent4" w:themeTint="99"/>
+              <w:right w:val="single" w:sz="4" w:space="0" w:color="60CAF3" w:themeColor="accent4" w:themeTint="99"/>
+            </w:tcBorders>
+            <w:hideMark/>
+          </w:tcPr>
+          <w:p>
+            <w:pPr>
+              <w:spacing w:line="259" w:lineRule="auto"/>
+              <w:ind w:left="115" w:firstLine="0"/>
+              <w:rPr>
+                <w:rFonts w:ascii="Times New Roman" w:eastAsia="Times New Roman" w:hAnsi="Times New Roman" w:cs="Times New Roman"/>
+              </w:rPr>
+            </w:pPr>
+          </w:p>
+        </w:tc>
+        <w:tc>
+          <w:tcPr>
+            <w:tcW w:w="0" w:type="auto"/>
+            <w:tcBorders>
+              <w:top w:val="single" w:sz="4" w:space="0" w:color="60CAF3" w:themeColor="accent4" w:themeTint="99"/>
+              <w:left w:val="single" w:sz="4" w:space="0" w:color="60CAF3" w:themeColor="accent4" w:themeTint="99"/>
+              <w:bottom w:val="single" w:sz="4" w:space="0" w:color="60CAF3" w:themeColor="accent4" w:themeTint="99"/>
+              <w:right w:val="single" w:sz="4" w:space="0" w:color="60CAF3" w:themeColor="accent4" w:themeTint="99"/>
+            </w:tcBorders>
+            <w:hideMark/>
+          </w:tcPr>
+          <w:p>
+            <w:pPr>
+              <w:spacing w:line="259" w:lineRule="auto"/>
+              <w:ind w:left="115" w:firstLine="0"/>
+              <w:cnfStyle w:val="000000100000" w:firstRow="0" w:lastRow="0" w:firstColumn="0" w:lastColumn="0" w:oddVBand="0" w:evenVBand="0" w:oddHBand="1" w:evenHBand="0" w:firstRowFirstColumn="0" w:firstRowLastColumn="0" w:lastRowFirstColumn="0" w:lastRowLastColumn="0"/>
+              <w:rPr>
+                <w:rFonts w:ascii="Times New Roman" w:eastAsia="Times New Roman" w:hAnsi="Times New Roman" w:cs="Times New Roman"/>
+                <w:b/>
+              </w:rPr>
+            </w:pPr>
+          </w:p>
+        </w:tc>
+        <w:tc>
+          <w:tcPr>
+            <w:tcW w:w="0" w:type="auto"/>
+            <w:tcBorders>
+              <w:top w:val="single" w:sz="4" w:space="0" w:color="60CAF3" w:themeColor="accent4" w:themeTint="99"/>
+              <w:left w:val="single" w:sz="4" w:space="0" w:color="60CAF3" w:themeColor="accent4" w:themeTint="99"/>
+              <w:bottom w:val="single" w:sz="4" w:space="0" w:color="60CAF3" w:themeColor="accent4" w:themeTint="99"/>
+              <w:right w:val="single" w:sz="4" w:space="0" w:color="60CAF3" w:themeColor="accent4" w:themeTint="99"/>
+            </w:tcBorders>
+            <w:hideMark/>
+          </w:tcPr>
+          <w:p>
+            <w:pPr>
+              <w:spacing w:line="259" w:lineRule="auto"/>
+              <w:ind w:left="115" w:firstLine="0"/>
+              <w:cnfStyle w:val="000000100000" w:firstRow="0" w:lastRow="0" w:firstColumn="0" w:lastColumn="0" w:oddVBand="0" w:evenVBand="0" w:oddHBand="1" w:evenHBand="0" w:firstRowFirstColumn="0" w:firstRowLastColumn="0" w:lastRowFirstColumn="0" w:lastRowLastColumn="0"/>
+              <w:rPr>
+                <w:rFonts w:ascii="Times New Roman" w:eastAsia="Times New Roman" w:hAnsi="Times New Roman" w:cs="Times New Roman"/>
+                <w:b/>
+              </w:rPr>
+            </w:pPr>
+          </w:p>
+        </w:tc>
+        <w:tc>
+          <w:tcPr>
+            <w:tcW w:w="0" w:type="auto"/>
+            <w:tcBorders>
+              <w:top w:val="single" w:sz="4" w:space="0" w:color="60CAF3" w:themeColor="accent4" w:themeTint="99"/>
+              <w:left w:val="single" w:sz="4" w:space="0" w:color="60CAF3" w:themeColor="accent4" w:themeTint="99"/>
+              <w:bottom w:val="single" w:sz="4" w:space="0" w:color="60CAF3" w:themeColor="accent4" w:themeTint="99"/>
+              <w:right w:val="single" w:sz="4" w:space="0" w:color="60CAF3" w:themeColor="accent4" w:themeTint="99"/>
+            </w:tcBorders>
+            <w:hideMark/>
+          </w:tcPr>
+          <w:p>
+            <w:pPr>
+              <w:spacing w:line="259" w:lineRule="auto"/>
+              <w:ind w:left="115" w:firstLine="0"/>
+              <w:cnfStyle w:val="000000100000" w:firstRow="0" w:lastRow="0" w:firstColumn="0" w:lastColumn="0" w:oddVBand="0" w:evenVBand="0" w:oddHBand="1" w:evenHBand="0" w:firstRowFirstColumn="0" w:firstRowLastColumn="0" w:lastRowFirstColumn="0" w:lastRowLastColumn="0"/>
+              <w:rPr>
+                <w:rFonts w:ascii="Times New Roman" w:eastAsia="Times New Roman" w:hAnsi="Times New Roman" w:cs="Times New Roman"/>
+                <w:b/>
+              </w:rPr>
+            </w:pPr>
+          </w:p>
+        </w:tc>
+        <w:tc>
+          <w:tcPr>
+            <w:tcW w:w="0" w:type="auto"/>
+            <w:tcBorders>
+              <w:top w:val="single" w:sz="4" w:space="0" w:color="60CAF3" w:themeColor="accent4" w:themeTint="99"/>
+              <w:left w:val="single" w:sz="4" w:space="0" w:color="60CAF3" w:themeColor="accent4" w:themeTint="99"/>
+              <w:bottom w:val="single" w:sz="4" w:space="0" w:color="60CAF3" w:themeColor="accent4" w:themeTint="99"/>
+              <w:right w:val="single" w:sz="4" w:space="0" w:color="60CAF3" w:themeColor="accent4" w:themeTint="99"/>
+            </w:tcBorders>
+            <w:hideMark/>
+          </w:tcPr>
+          <w:p>
+            <w:pPr>
+              <w:spacing w:line="259" w:lineRule="auto"/>
+              <w:ind w:left="115" w:firstLine="0"/>
+              <w:cnfStyle w:val="000000100000" w:firstRow="0" w:lastRow="0" w:firstColumn="0" w:lastColumn="0" w:oddVBand="0" w:evenVBand="0" w:oddHBand="1" w:evenHBand="0" w:firstRowFirstColumn="0" w:firstRowLastColumn="0" w:lastRowFirstColumn="0" w:lastRowLastColumn="0"/>
+              <w:rPr>
+                <w:rFonts w:ascii="Times New Roman" w:eastAsia="Times New Roman" w:hAnsi="Times New Roman" w:cs="Times New Roman"/>
+                <w:b/>
+              </w:rPr>
+            </w:pPr>
+          </w:p>
+        </w:tc>
+      </w:tr>
+      <w:tr>
+        <w:tc>
+          <w:tcPr>
+            <w:cnfStyle w:val="001000000000" w:firstRow="0" w:lastRow="0" w:firstColumn="1" w:lastColumn="0" w:oddVBand="0" w:evenVBand="0" w:oddHBand="0" w:evenHBand="0" w:firstRowFirstColumn="0" w:firstRowLastColumn="0" w:lastRowFirstColumn="0" w:lastRowLastColumn="0"/>
+            <w:tcW w:w="0" w:type="auto"/>
+            <w:tcBorders>
+              <w:top w:val="single" w:sz="4" w:space="0" w:color="60CAF3" w:themeColor="accent4" w:themeTint="99"/>
+              <w:left w:val="single" w:sz="4" w:space="0" w:color="60CAF3" w:themeColor="accent4" w:themeTint="99"/>
+              <w:bottom w:val="single" w:sz="4" w:space="0" w:color="60CAF3" w:themeColor="accent4" w:themeTint="99"/>
+              <w:right w:val="single" w:sz="4" w:space="0" w:color="60CAF3" w:themeColor="accent4" w:themeTint="99"/>
+            </w:tcBorders>
+            <w:hideMark/>
+          </w:tcPr>
+          <w:p>
+            <w:pPr>
+              <w:spacing w:line="259" w:lineRule="auto"/>
+              <w:ind w:left="115" w:firstLine="0"/>
+              <w:rPr>
+                <w:rFonts w:ascii="Times New Roman" w:eastAsia="Times New Roman" w:hAnsi="Times New Roman" w:cs="Times New Roman"/>
+              </w:rPr>
+            </w:pPr>
+          </w:p>
+        </w:tc>
+        <w:tc>
+          <w:tcPr>
+            <w:tcW w:w="0" w:type="auto"/>
+            <w:tcBorders>
+              <w:top w:val="single" w:sz="4" w:space="0" w:color="60CAF3" w:themeColor="accent4" w:themeTint="99"/>
+              <w:left w:val="single" w:sz="4" w:space="0" w:color="60CAF3" w:themeColor="accent4" w:themeTint="99"/>
+              <w:bottom w:val="single" w:sz="4" w:space="0" w:color="60CAF3" w:themeColor="accent4" w:themeTint="99"/>
+              <w:right w:val="single" w:sz="4" w:space="0" w:color="60CAF3" w:themeColor="accent4" w:themeTint="99"/>
+            </w:tcBorders>
+            <w:hideMark/>
+          </w:tcPr>
+          <w:p>
+            <w:pPr>
+              <w:spacing w:line="259" w:lineRule="auto"/>
+              <w:ind w:left="115" w:firstLine="0"/>
+              <w:cnfStyle w:val="000000000000" w:firstRow="0" w:lastRow="0" w:firstColumn="0" w:lastColumn="0" w:oddVBand="0" w:evenVBand="0" w:oddHBand="0" w:evenHBand="0" w:firstRowFirstColumn="0" w:firstRowLastColumn="0" w:lastRowFirstColumn="0" w:lastRowLastColumn="0"/>
+              <w:rPr>
+                <w:rFonts w:ascii="Times New Roman" w:eastAsia="Times New Roman" w:hAnsi="Times New Roman" w:cs="Times New Roman"/>
+                <w:b/>
+              </w:rPr>
+            </w:pPr>
+          </w:p>
+        </w:tc>
+        <w:tc>
+          <w:tcPr>
+            <w:tcW w:w="0" w:type="auto"/>
+            <w:tcBorders>
+              <w:top w:val="single" w:sz="4" w:space="0" w:color="60CAF3" w:themeColor="accent4" w:themeTint="99"/>
+              <w:left w:val="single" w:sz="4" w:space="0" w:color="60CAF3" w:themeColor="accent4" w:themeTint="99"/>
+              <w:bottom w:val="single" w:sz="4" w:space="0" w:color="60CAF3" w:themeColor="accent4" w:themeTint="99"/>
+              <w:right w:val="single" w:sz="4" w:space="0" w:color="60CAF3" w:themeColor="accent4" w:themeTint="99"/>
+            </w:tcBorders>
+            <w:hideMark/>
+          </w:tcPr>
+          <w:p>
+            <w:pPr>
+              <w:spacing w:line="259" w:lineRule="auto"/>
+              <w:ind w:left="115" w:firstLine="0"/>
+              <w:cnfStyle w:val="000000000000" w:firstRow="0" w:lastRow="0" w:firstColumn="0" w:lastColumn="0" w:oddVBand="0" w:evenVBand="0" w:oddHBand="0" w:evenHBand="0" w:firstRowFirstColumn="0" w:firstRowLastColumn="0" w:lastRowFirstColumn="0" w:lastRowLastColumn="0"/>
+              <w:rPr>
+                <w:rFonts w:ascii="Times New Roman" w:eastAsia="Times New Roman" w:hAnsi="Times New Roman" w:cs="Times New Roman"/>
+                <w:b/>
+              </w:rPr>
+            </w:pPr>
+          </w:p>
+        </w:tc>
+        <w:tc>
+          <w:tcPr>
+            <w:tcW w:w="0" w:type="auto"/>
+            <w:tcBorders>
+              <w:top w:val="single" w:sz="4" w:space="0" w:color="60CAF3" w:themeColor="accent4" w:themeTint="99"/>
+              <w:left w:val="single" w:sz="4" w:space="0" w:color="60CAF3" w:themeColor="accent4" w:themeTint="99"/>
+              <w:bottom w:val="single" w:sz="4" w:space="0" w:color="60CAF3" w:themeColor="accent4" w:themeTint="99"/>
+              <w:right w:val="single" w:sz="4" w:space="0" w:color="60CAF3" w:themeColor="accent4" w:themeTint="99"/>
+            </w:tcBorders>
+            <w:hideMark/>
+          </w:tcPr>
+          <w:p>
+            <w:pPr>
+              <w:spacing w:line="259" w:lineRule="auto"/>
+              <w:ind w:left="115" w:firstLine="0"/>
+              <w:cnfStyle w:val="000000000000" w:firstRow="0" w:lastRow="0" w:firstColumn="0" w:lastColumn="0" w:oddVBand="0" w:evenVBand="0" w:oddHBand="0" w:evenHBand="0" w:firstRowFirstColumn="0" w:firstRowLastColumn="0" w:lastRowFirstColumn="0" w:lastRowLastColumn="0"/>
+              <w:rPr>
+                <w:rFonts w:ascii="Times New Roman" w:eastAsia="Times New Roman" w:hAnsi="Times New Roman" w:cs="Times New Roman"/>
+                <w:b/>
+              </w:rPr>
+            </w:pPr>
+          </w:p>
+        </w:tc>
+        <w:tc>
+          <w:tcPr>
+            <w:tcW w:w="0" w:type="auto"/>
+            <w:tcBorders>
+              <w:top w:val="single" w:sz="4" w:space="0" w:color="60CAF3" w:themeColor="accent4" w:themeTint="99"/>
+              <w:left w:val="single" w:sz="4" w:space="0" w:color="60CAF3" w:themeColor="accent4" w:themeTint="99"/>
+              <w:bottom w:val="single" w:sz="4" w:space="0" w:color="60CAF3" w:themeColor="accent4" w:themeTint="99"/>
+              <w:right w:val="single" w:sz="4" w:space="0" w:color="60CAF3" w:themeColor="accent4" w:themeTint="99"/>
+            </w:tcBorders>
+            <w:hideMark/>
+          </w:tcPr>
+          <w:p>
+            <w:pPr>
+              <w:spacing w:line="259" w:lineRule="auto"/>
+              <w:ind w:left="115" w:firstLine="0"/>
+              <w:cnfStyle w:val="000000000000" w:firstRow="0" w:lastRow="0" w:firstColumn="0" w:lastColumn="0" w:oddVBand="0" w:evenVBand="0" w:oddHBand="0" w:evenHBand="0" w:firstRowFirstColumn="0" w:firstRowLastColumn="0" w:lastRowFirstColumn="0" w:lastRowLastColumn="0"/>
+              <w:rPr>
+                <w:rFonts w:ascii="Times New Roman" w:eastAsia="Times New Roman" w:hAnsi="Times New Roman" w:cs="Times New Roman"/>
+                <w:b/>
+              </w:rPr>
+            </w:pPr>
+          </w:p>
+        </w:tc>
+      </w:tr>
+    </w:tbl>
+    <w:p>
+      <w:pPr>
+        <w:spacing w:line="259" w:lineRule="auto"/>
+        <w:ind w:left="115" w:firstLine="0"/>
         <w:rPr>
           <w:rFonts w:ascii="Times New Roman" w:eastAsia="Times New Roman" w:hAnsi="Times New Roman" w:cs="Times New Roman"/>
           <w:b/>
-        </w:rPr>
+          <w:bCs/>
+        </w:rPr>
+      </w:pPr>
+    </w:p>
+    <w:p>
+      <w:pPr>
+        <w:spacing w:line="259" w:lineRule="auto"/>
+        <w:ind w:left="115" w:firstLine="0"/>
+        <w:rPr>
+          <w:rFonts w:ascii="Times New Roman" w:eastAsia="Times New Roman" w:hAnsi="Times New Roman" w:cs="Times New Roman"/>
+          <w:b/>
+          <w:bCs/>
+        </w:rPr>
+      </w:pPr>
+      <w:r>
+        <w:rPr>
+          <w:rFonts w:ascii="Times New Roman" w:eastAsia="Times New Roman" w:hAnsi="Times New Roman" w:cs="Times New Roman"/>
+          <w:b/>
+          <w:bCs/>
+        </w:rPr>
+        <w:br w:type="page"/>
+      </w:r>
+    </w:p>
+    <w:p>
+      <w:pPr>
+        <w:spacing w:line="259" w:lineRule="auto"/>
+        <w:ind w:left="115" w:firstLine="0"/>
+      </w:pPr>
+      <w:r>
+        <w:rPr>
+          <w:rFonts w:ascii="Times New Roman" w:eastAsia="Times New Roman" w:hAnsi="Times New Roman" w:cs="Times New Roman"/>
+          <w:b/>
+        </w:rPr>
+        <w:lastRenderedPageBreak/>
         <w:t xml:space="preserve"> </w:t>
       </w:r>
     </w:p>
@@ -178,7 +916,7 @@
                     <pic:cNvPicPr/>
                   </pic:nvPicPr>
                   <pic:blipFill>
-                    <a:blip r:embed="rId4" cstate="print">
+                    <a:blip r:embed="rId7" cstate="print">
                       <a:extLst>
                         <a:ext uri="{28A0092B-C50C-407E-A947-70E740481C1C}">
                           <a14:useLocalDpi xmlns:a14="http://schemas.microsoft.com/office/drawing/2010/main" val="0"/>
@@ -216,6 +954,7 @@
           <w:color w:val="13979C"/>
           <w:sz w:val="40"/>
         </w:rPr>
+        <w:lastRenderedPageBreak/>
         <w:t xml:space="preserve"> </w:t>
       </w:r>
     </w:p>
@@ -229,7 +968,6 @@
           <w:rFonts w:ascii="Times New Roman" w:eastAsia="Times New Roman" w:hAnsi="Times New Roman" w:cs="Times New Roman"/>
           <w:b/>
         </w:rPr>
-        <w:lastRenderedPageBreak/>
         <w:t xml:space="preserve"> </w:t>
       </w:r>
     </w:p>
@@ -538,6 +1276,7 @@
         <w:ind w:left="655" w:firstLine="0"/>
       </w:pPr>
       <w:r>
+        <w:lastRenderedPageBreak/>
         <w:t xml:space="preserve">No participant, volunteer, job applicant or employee of the club will receive less favourable treatment on the grounds of gender, age, colour, disability, ethnic origin, parental or </w:t>
       </w:r>
       <w:proofErr w:type="gramStart"/>
@@ -578,7 +1317,6 @@
         <w:ind w:left="110"/>
       </w:pPr>
       <w:r>
-        <w:lastRenderedPageBreak/>
         <w:t xml:space="preserve">5. Welfare Statement </w:t>
       </w:r>
     </w:p>
@@ -803,6 +1541,7 @@
         <w:rPr>
           <w:b/>
         </w:rPr>
+        <w:lastRenderedPageBreak/>
         <w:t xml:space="preserve"> </w:t>
       </w:r>
     </w:p>
@@ -896,7 +1635,6 @@
         <w:ind w:left="115" w:firstLine="0"/>
       </w:pPr>
       <w:r>
-        <w:lastRenderedPageBreak/>
         <w:t xml:space="preserve"> </w:t>
       </w:r>
     </w:p>
@@ -1125,6 +1863,7 @@
         <w:ind w:left="115" w:firstLine="0"/>
       </w:pPr>
       <w:r>
+        <w:lastRenderedPageBreak/>
         <w:t xml:space="preserve"> </w:t>
       </w:r>
     </w:p>
@@ -1223,11 +1962,7 @@
         <w:t xml:space="preserve"> </w:t>
       </w:r>
       <w:r>
-        <w:t xml:space="preserve">The dates of the AGM and the Management Committee meetings shall be determined at the previous meeting. In </w:t>
-      </w:r>
-      <w:r>
-        <w:lastRenderedPageBreak/>
-        <w:t xml:space="preserve">addition, the Chairperson may call a meeting when he or she considers it necessary or desirable, or upon the written request of at least three members of the Management Committee. </w:t>
+        <w:t xml:space="preserve">The dates of the AGM and the Management Committee meetings shall be determined at the previous meeting. In addition, the Chairperson may call a meeting when he or she considers it necessary or desirable, or upon the written request of at least three members of the Management Committee. </w:t>
       </w:r>
     </w:p>
     <w:p>
@@ -1410,7 +2145,11 @@
         <w:ind w:left="650"/>
       </w:pPr>
       <w:r>
-        <w:t xml:space="preserve">12.1 The Management Committee shall have the authority to take appropriate disciplinary action against any member or employee of the club and the discretion to terminate membership or employment if any person is found guilty of conduct deemed detrimental to the club. </w:t>
+        <w:t xml:space="preserve">12.1 The Management Committee shall have the authority to take appropriate disciplinary action against any member or </w:t>
+      </w:r>
+      <w:r>
+        <w:lastRenderedPageBreak/>
+        <w:t xml:space="preserve">employee of the club and the discretion to terminate membership or employment if any person is found guilty of conduct deemed detrimental to the club. </w:t>
       </w:r>
     </w:p>
     <w:p>
@@ -1509,11 +2248,7 @@
         <w:ind w:left="650"/>
       </w:pPr>
       <w:r>
-        <w:t xml:space="preserve">12.6 An Appeal Hearing should be convened by a member of the Management Committee and no more than four additional Club </w:t>
-      </w:r>
-      <w:r>
-        <w:lastRenderedPageBreak/>
-        <w:t xml:space="preserve">members who are independent of the original Disciplinary Hearing and subsequent decision. </w:t>
+        <w:t xml:space="preserve">12.6 An Appeal Hearing should be convened by a member of the Management Committee and no more than four additional Club members who are independent of the original Disciplinary Hearing and subsequent decision. </w:t>
       </w:r>
     </w:p>
     <w:p>
@@ -1703,6 +2438,7 @@
         <w:ind w:left="650"/>
       </w:pPr>
       <w:r>
+        <w:lastRenderedPageBreak/>
         <w:t>14.3</w:t>
       </w:r>
       <w:r>
@@ -1820,12 +2556,374 @@
       </w:r>
     </w:p>
     <w:sectPr>
+      <w:headerReference w:type="even" r:id="rId8"/>
+      <w:headerReference w:type="default" r:id="rId9"/>
+      <w:footerReference w:type="even" r:id="rId10"/>
+      <w:footerReference w:type="default" r:id="rId11"/>
+      <w:headerReference w:type="first" r:id="rId12"/>
+      <w:footerReference w:type="first" r:id="rId13"/>
       <w:pgSz w:w="11904" w:h="16838"/>
       <w:pgMar w:top="719" w:right="1799" w:bottom="1457" w:left="1685" w:header="720" w:footer="720" w:gutter="0"/>
       <w:cols w:space="720"/>
     </w:sectPr>
   </w:body>
 </w:document>
+</file>
+
+<file path=word/endnotes.xml><?xml version="1.0" encoding="utf-8"?>
+<w:endnotes xmlns:wpc="http://schemas.microsoft.com/office/word/2010/wordprocessingCanvas" xmlns:cx="http://schemas.microsoft.com/office/drawing/2014/chartex" xmlns:cx1="http://schemas.microsoft.com/office/drawing/2015/9/8/chartex" xmlns:cx2="http://schemas.microsoft.com/office/drawing/2015/10/21/chartex" xmlns:cx3="http://schemas.microsoft.com/office/drawing/2016/5/9/chartex" xmlns:cx4="http://schemas.microsoft.com/office/drawing/2016/5/10/chartex" xmlns:cx5="http://schemas.microsoft.com/office/drawing/2016/5/11/chartex" xmlns:cx6="http://schemas.microsoft.com/office/drawing/2016/5/12/chartex" xmlns:cx7="http://schemas.microsoft.com/office/drawing/2016/5/13/chartex" xmlns:cx8="http://schemas.microsoft.com/office/drawing/2016/5/14/chartex" xmlns:mc="http://schemas.openxmlformats.org/markup-compatibility/2006" xmlns:aink="http://schemas.microsoft.com/office/drawing/2016/ink" xmlns:am3d="http://schemas.microsoft.com/office/drawing/2017/model3d" xmlns:o="urn:schemas-microsoft-com:office:office" xmlns:oel="http://schemas.microsoft.com/office/2019/extlst" xmlns:r="http://schemas.openxmlformats.org/officeDocument/2006/relationships" xmlns:m="http://schemas.openxmlformats.org/officeDocument/2006/math" xmlns:v="urn:schemas-microsoft-com:vml" xmlns:wp14="http://schemas.microsoft.com/office/word/2010/wordprocessingDrawing" xmlns:wp="http://schemas.openxmlformats.org/drawingml/2006/wordprocessingDrawing" xmlns:w10="urn:schemas-microsoft-com:office:word" xmlns:w="http://schemas.openxmlformats.org/wordprocessingml/2006/main" xmlns:w14="http://schemas.microsoft.com/office/word/2010/wordml" xmlns:w15="http://schemas.microsoft.com/office/word/2012/wordml" xmlns:w16cex="http://schemas.microsoft.com/office/word/2018/wordml/cex" xmlns:w16cid="http://schemas.microsoft.com/office/word/2016/wordml/cid" xmlns:w16="http://schemas.microsoft.com/office/word/2018/wordml" xmlns:w16du="http://schemas.microsoft.com/office/word/2023/wordml/word16du" xmlns:w16sdtdh="http://schemas.microsoft.com/office/word/2020/wordml/sdtdatahash" xmlns:w16sdtfl="http://schemas.microsoft.com/office/word/2024/wordml/sdtformatlock" xmlns:w16se="http://schemas.microsoft.com/office/word/2015/wordml/symex" xmlns:wpg="http://schemas.microsoft.com/office/word/2010/wordprocessingGroup" xmlns:wpi="http://schemas.microsoft.com/office/word/2010/wordprocessingInk" xmlns:wne="http://schemas.microsoft.com/office/word/2006/wordml" xmlns:wps="http://schemas.microsoft.com/office/word/2010/wordprocessingShape" mc:Ignorable="w14 w15 w16se w16cid w16 w16cex w16sdtdh w16sdtfl w16du wp14">
+  <w:endnote w:type="separator" w:id="-1">
+    <w:p>
+      <w:pPr>
+        <w:spacing w:line="240" w:lineRule="auto"/>
+      </w:pPr>
+      <w:r>
+        <w:separator/>
+      </w:r>
+    </w:p>
+  </w:endnote>
+  <w:endnote w:type="continuationSeparator" w:id="0">
+    <w:p>
+      <w:pPr>
+        <w:spacing w:line="240" w:lineRule="auto"/>
+      </w:pPr>
+      <w:r>
+        <w:continuationSeparator/>
+      </w:r>
+    </w:p>
+  </w:endnote>
+</w:endnotes>
+</file>
+
+<file path=word/footer1.xml><?xml version="1.0" encoding="utf-8"?>
+<w:ftr xmlns:wpc="http://schemas.microsoft.com/office/word/2010/wordprocessingCanvas" xmlns:cx="http://schemas.microsoft.com/office/drawing/2014/chartex" xmlns:cx1="http://schemas.microsoft.com/office/drawing/2015/9/8/chartex" xmlns:cx2="http://schemas.microsoft.com/office/drawing/2015/10/21/chartex" xmlns:cx3="http://schemas.microsoft.com/office/drawing/2016/5/9/chartex" xmlns:cx4="http://schemas.microsoft.com/office/drawing/2016/5/10/chartex" xmlns:cx5="http://schemas.microsoft.com/office/drawing/2016/5/11/chartex" xmlns:cx6="http://schemas.microsoft.com/office/drawing/2016/5/12/chartex" xmlns:cx7="http://schemas.microsoft.com/office/drawing/2016/5/13/chartex" xmlns:cx8="http://schemas.microsoft.com/office/drawing/2016/5/14/chartex" xmlns:mc="http://schemas.openxmlformats.org/markup-compatibility/2006" xmlns:aink="http://schemas.microsoft.com/office/drawing/2016/ink" xmlns:am3d="http://schemas.microsoft.com/office/drawing/2017/model3d" xmlns:o="urn:schemas-microsoft-com:office:office" xmlns:oel="http://schemas.microsoft.com/office/2019/extlst" xmlns:r="http://schemas.openxmlformats.org/officeDocument/2006/relationships" xmlns:m="http://schemas.openxmlformats.org/officeDocument/2006/math" xmlns:v="urn:schemas-microsoft-com:vml" xmlns:wp14="http://schemas.microsoft.com/office/word/2010/wordprocessingDrawing" xmlns:wp="http://schemas.openxmlformats.org/drawingml/2006/wordprocessingDrawing" xmlns:w10="urn:schemas-microsoft-com:office:word" xmlns:w="http://schemas.openxmlformats.org/wordprocessingml/2006/main" xmlns:w14="http://schemas.microsoft.com/office/word/2010/wordml" xmlns:w15="http://schemas.microsoft.com/office/word/2012/wordml" xmlns:w16cex="http://schemas.microsoft.com/office/word/2018/wordml/cex" xmlns:w16cid="http://schemas.microsoft.com/office/word/2016/wordml/cid" xmlns:w16="http://schemas.microsoft.com/office/word/2018/wordml" xmlns:w16du="http://schemas.microsoft.com/office/word/2023/wordml/word16du" xmlns:w16sdtdh="http://schemas.microsoft.com/office/word/2020/wordml/sdtdatahash" xmlns:w16sdtfl="http://schemas.microsoft.com/office/word/2024/wordml/sdtformatlock" xmlns:w16se="http://schemas.microsoft.com/office/word/2015/wordml/symex" xmlns:wpg="http://schemas.microsoft.com/office/word/2010/wordprocessingGroup" xmlns:wpi="http://schemas.microsoft.com/office/word/2010/wordprocessingInk" xmlns:wne="http://schemas.microsoft.com/office/word/2006/wordml" xmlns:wps="http://schemas.microsoft.com/office/word/2010/wordprocessingShape" mc:Ignorable="w14 w15 w16se w16cid w16 w16cex w16sdtdh w16sdtfl w16du wp14">
+  <w:p>
+    <w:pPr>
+      <w:pStyle w:val="Footer"/>
+    </w:pPr>
+  </w:p>
+</w:ftr>
+</file>
+
+<file path=word/footer2.xml><?xml version="1.0" encoding="utf-8"?>
+<w:ftr xmlns:wpc="http://schemas.microsoft.com/office/word/2010/wordprocessingCanvas" xmlns:cx="http://schemas.microsoft.com/office/drawing/2014/chartex" xmlns:cx1="http://schemas.microsoft.com/office/drawing/2015/9/8/chartex" xmlns:cx2="http://schemas.microsoft.com/office/drawing/2015/10/21/chartex" xmlns:cx3="http://schemas.microsoft.com/office/drawing/2016/5/9/chartex" xmlns:cx4="http://schemas.microsoft.com/office/drawing/2016/5/10/chartex" xmlns:cx5="http://schemas.microsoft.com/office/drawing/2016/5/11/chartex" xmlns:cx6="http://schemas.microsoft.com/office/drawing/2016/5/12/chartex" xmlns:cx7="http://schemas.microsoft.com/office/drawing/2016/5/13/chartex" xmlns:cx8="http://schemas.microsoft.com/office/drawing/2016/5/14/chartex" xmlns:mc="http://schemas.openxmlformats.org/markup-compatibility/2006" xmlns:aink="http://schemas.microsoft.com/office/drawing/2016/ink" xmlns:am3d="http://schemas.microsoft.com/office/drawing/2017/model3d" xmlns:o="urn:schemas-microsoft-com:office:office" xmlns:oel="http://schemas.microsoft.com/office/2019/extlst" xmlns:r="http://schemas.openxmlformats.org/officeDocument/2006/relationships" xmlns:m="http://schemas.openxmlformats.org/officeDocument/2006/math" xmlns:v="urn:schemas-microsoft-com:vml" xmlns:wp14="http://schemas.microsoft.com/office/word/2010/wordprocessingDrawing" xmlns:wp="http://schemas.openxmlformats.org/drawingml/2006/wordprocessingDrawing" xmlns:w10="urn:schemas-microsoft-com:office:word" xmlns:w="http://schemas.openxmlformats.org/wordprocessingml/2006/main" xmlns:w14="http://schemas.microsoft.com/office/word/2010/wordml" xmlns:w15="http://schemas.microsoft.com/office/word/2012/wordml" xmlns:w16cex="http://schemas.microsoft.com/office/word/2018/wordml/cex" xmlns:w16cid="http://schemas.microsoft.com/office/word/2016/wordml/cid" xmlns:w16="http://schemas.microsoft.com/office/word/2018/wordml" xmlns:w16du="http://schemas.microsoft.com/office/word/2023/wordml/word16du" xmlns:w16sdtdh="http://schemas.microsoft.com/office/word/2020/wordml/sdtdatahash" xmlns:w16sdtfl="http://schemas.microsoft.com/office/word/2024/wordml/sdtformatlock" xmlns:w16se="http://schemas.microsoft.com/office/word/2015/wordml/symex" xmlns:wpg="http://schemas.microsoft.com/office/word/2010/wordprocessingGroup" xmlns:wpi="http://schemas.microsoft.com/office/word/2010/wordprocessingInk" xmlns:wne="http://schemas.microsoft.com/office/word/2006/wordml" xmlns:wps="http://schemas.microsoft.com/office/word/2010/wordprocessingShape" mc:Ignorable="w14 w15 w16se w16cid w16 w16cex w16sdtdh w16sdtfl w16du wp14">
+  <w:p>
+    <w:pPr>
+      <w:pStyle w:val="Footer"/>
+      <w:jc w:val="center"/>
+      <w:rPr>
+        <w:color w:val="156082" w:themeColor="accent1"/>
+      </w:rPr>
+    </w:pPr>
+    <w:r>
+      <w:rPr>
+        <w:color w:val="156082" w:themeColor="accent1"/>
+      </w:rPr>
+      <w:t xml:space="preserve">Page </w:t>
+    </w:r>
+    <w:r>
+      <w:rPr>
+        <w:color w:val="156082" w:themeColor="accent1"/>
+      </w:rPr>
+      <w:fldChar w:fldCharType="begin"/>
+    </w:r>
+    <w:r>
+      <w:rPr>
+        <w:color w:val="156082" w:themeColor="accent1"/>
+      </w:rPr>
+      <w:instrText xml:space="preserve"> PAGE  \* Arabic  \* MERGEFORMAT </w:instrText>
+    </w:r>
+    <w:r>
+      <w:rPr>
+        <w:color w:val="156082" w:themeColor="accent1"/>
+      </w:rPr>
+      <w:fldChar w:fldCharType="separate"/>
+    </w:r>
+    <w:r>
+      <w:rPr>
+        <w:noProof/>
+        <w:color w:val="156082" w:themeColor="accent1"/>
+      </w:rPr>
+      <w:t>2</w:t>
+    </w:r>
+    <w:r>
+      <w:rPr>
+        <w:color w:val="156082" w:themeColor="accent1"/>
+      </w:rPr>
+      <w:fldChar w:fldCharType="end"/>
+    </w:r>
+    <w:r>
+      <w:rPr>
+        <w:color w:val="156082" w:themeColor="accent1"/>
+      </w:rPr>
+      <w:t xml:space="preserve"> of </w:t>
+    </w:r>
+    <w:r>
+      <w:rPr>
+        <w:color w:val="156082" w:themeColor="accent1"/>
+      </w:rPr>
+      <w:fldChar w:fldCharType="begin"/>
+    </w:r>
+    <w:r>
+      <w:rPr>
+        <w:color w:val="156082" w:themeColor="accent1"/>
+      </w:rPr>
+      <w:instrText xml:space="preserve"> NUMPAGES  \* Arabic  \* MERGEFORMAT </w:instrText>
+    </w:r>
+    <w:r>
+      <w:rPr>
+        <w:color w:val="156082" w:themeColor="accent1"/>
+      </w:rPr>
+      <w:fldChar w:fldCharType="separate"/>
+    </w:r>
+    <w:r>
+      <w:rPr>
+        <w:noProof/>
+        <w:color w:val="156082" w:themeColor="accent1"/>
+      </w:rPr>
+      <w:t>2</w:t>
+    </w:r>
+    <w:r>
+      <w:rPr>
+        <w:color w:val="156082" w:themeColor="accent1"/>
+      </w:rPr>
+      <w:fldChar w:fldCharType="end"/>
+    </w:r>
+  </w:p>
+  <w:p>
+    <w:pPr>
+      <w:pStyle w:val="Footer"/>
+    </w:pPr>
+  </w:p>
+</w:ftr>
+</file>
+
+<file path=word/footer3.xml><?xml version="1.0" encoding="utf-8"?>
+<w:ftr xmlns:wpc="http://schemas.microsoft.com/office/word/2010/wordprocessingCanvas" xmlns:cx="http://schemas.microsoft.com/office/drawing/2014/chartex" xmlns:cx1="http://schemas.microsoft.com/office/drawing/2015/9/8/chartex" xmlns:cx2="http://schemas.microsoft.com/office/drawing/2015/10/21/chartex" xmlns:cx3="http://schemas.microsoft.com/office/drawing/2016/5/9/chartex" xmlns:cx4="http://schemas.microsoft.com/office/drawing/2016/5/10/chartex" xmlns:cx5="http://schemas.microsoft.com/office/drawing/2016/5/11/chartex" xmlns:cx6="http://schemas.microsoft.com/office/drawing/2016/5/12/chartex" xmlns:cx7="http://schemas.microsoft.com/office/drawing/2016/5/13/chartex" xmlns:cx8="http://schemas.microsoft.com/office/drawing/2016/5/14/chartex" xmlns:mc="http://schemas.openxmlformats.org/markup-compatibility/2006" xmlns:aink="http://schemas.microsoft.com/office/drawing/2016/ink" xmlns:am3d="http://schemas.microsoft.com/office/drawing/2017/model3d" xmlns:o="urn:schemas-microsoft-com:office:office" xmlns:oel="http://schemas.microsoft.com/office/2019/extlst" xmlns:r="http://schemas.openxmlformats.org/officeDocument/2006/relationships" xmlns:m="http://schemas.openxmlformats.org/officeDocument/2006/math" xmlns:v="urn:schemas-microsoft-com:vml" xmlns:wp14="http://schemas.microsoft.com/office/word/2010/wordprocessingDrawing" xmlns:wp="http://schemas.openxmlformats.org/drawingml/2006/wordprocessingDrawing" xmlns:w10="urn:schemas-microsoft-com:office:word" xmlns:w="http://schemas.openxmlformats.org/wordprocessingml/2006/main" xmlns:w14="http://schemas.microsoft.com/office/word/2010/wordml" xmlns:w15="http://schemas.microsoft.com/office/word/2012/wordml" xmlns:w16cex="http://schemas.microsoft.com/office/word/2018/wordml/cex" xmlns:w16cid="http://schemas.microsoft.com/office/word/2016/wordml/cid" xmlns:w16="http://schemas.microsoft.com/office/word/2018/wordml" xmlns:w16du="http://schemas.microsoft.com/office/word/2023/wordml/word16du" xmlns:w16sdtdh="http://schemas.microsoft.com/office/word/2020/wordml/sdtdatahash" xmlns:w16sdtfl="http://schemas.microsoft.com/office/word/2024/wordml/sdtformatlock" xmlns:w16se="http://schemas.microsoft.com/office/word/2015/wordml/symex" xmlns:wpg="http://schemas.microsoft.com/office/word/2010/wordprocessingGroup" xmlns:wpi="http://schemas.microsoft.com/office/word/2010/wordprocessingInk" xmlns:wne="http://schemas.microsoft.com/office/word/2006/wordml" xmlns:wps="http://schemas.microsoft.com/office/word/2010/wordprocessingShape" mc:Ignorable="w14 w15 w16se w16cid w16 w16cex w16sdtdh w16sdtfl w16du wp14">
+  <w:p>
+    <w:pPr>
+      <w:pStyle w:val="Footer"/>
+    </w:pPr>
+  </w:p>
+</w:ftr>
+</file>
+
+<file path=word/footnotes.xml><?xml version="1.0" encoding="utf-8"?>
+<w:footnotes xmlns:wpc="http://schemas.microsoft.com/office/word/2010/wordprocessingCanvas" xmlns:cx="http://schemas.microsoft.com/office/drawing/2014/chartex" xmlns:cx1="http://schemas.microsoft.com/office/drawing/2015/9/8/chartex" xmlns:cx2="http://schemas.microsoft.com/office/drawing/2015/10/21/chartex" xmlns:cx3="http://schemas.microsoft.com/office/drawing/2016/5/9/chartex" xmlns:cx4="http://schemas.microsoft.com/office/drawing/2016/5/10/chartex" xmlns:cx5="http://schemas.microsoft.com/office/drawing/2016/5/11/chartex" xmlns:cx6="http://schemas.microsoft.com/office/drawing/2016/5/12/chartex" xmlns:cx7="http://schemas.microsoft.com/office/drawing/2016/5/13/chartex" xmlns:cx8="http://schemas.microsoft.com/office/drawing/2016/5/14/chartex" xmlns:mc="http://schemas.openxmlformats.org/markup-compatibility/2006" xmlns:aink="http://schemas.microsoft.com/office/drawing/2016/ink" xmlns:am3d="http://schemas.microsoft.com/office/drawing/2017/model3d" xmlns:o="urn:schemas-microsoft-com:office:office" xmlns:oel="http://schemas.microsoft.com/office/2019/extlst" xmlns:r="http://schemas.openxmlformats.org/officeDocument/2006/relationships" xmlns:m="http://schemas.openxmlformats.org/officeDocument/2006/math" xmlns:v="urn:schemas-microsoft-com:vml" xmlns:wp14="http://schemas.microsoft.com/office/word/2010/wordprocessingDrawing" xmlns:wp="http://schemas.openxmlformats.org/drawingml/2006/wordprocessingDrawing" xmlns:w10="urn:schemas-microsoft-com:office:word" xmlns:w="http://schemas.openxmlformats.org/wordprocessingml/2006/main" xmlns:w14="http://schemas.microsoft.com/office/word/2010/wordml" xmlns:w15="http://schemas.microsoft.com/office/word/2012/wordml" xmlns:w16cex="http://schemas.microsoft.com/office/word/2018/wordml/cex" xmlns:w16cid="http://schemas.microsoft.com/office/word/2016/wordml/cid" xmlns:w16="http://schemas.microsoft.com/office/word/2018/wordml" xmlns:w16du="http://schemas.microsoft.com/office/word/2023/wordml/word16du" xmlns:w16sdtdh="http://schemas.microsoft.com/office/word/2020/wordml/sdtdatahash" xmlns:w16sdtfl="http://schemas.microsoft.com/office/word/2024/wordml/sdtformatlock" xmlns:w16se="http://schemas.microsoft.com/office/word/2015/wordml/symex" xmlns:wpg="http://schemas.microsoft.com/office/word/2010/wordprocessingGroup" xmlns:wpi="http://schemas.microsoft.com/office/word/2010/wordprocessingInk" xmlns:wne="http://schemas.microsoft.com/office/word/2006/wordml" xmlns:wps="http://schemas.microsoft.com/office/word/2010/wordprocessingShape" mc:Ignorable="w14 w15 w16se w16cid w16 w16cex w16sdtdh w16sdtfl w16du wp14">
+  <w:footnote w:type="separator" w:id="-1">
+    <w:p>
+      <w:pPr>
+        <w:spacing w:line="240" w:lineRule="auto"/>
+      </w:pPr>
+      <w:r>
+        <w:separator/>
+      </w:r>
+    </w:p>
+  </w:footnote>
+  <w:footnote w:type="continuationSeparator" w:id="0">
+    <w:p>
+      <w:pPr>
+        <w:spacing w:line="240" w:lineRule="auto"/>
+      </w:pPr>
+      <w:r>
+        <w:continuationSeparator/>
+      </w:r>
+    </w:p>
+  </w:footnote>
+</w:footnotes>
+</file>
+
+<file path=word/header1.xml><?xml version="1.0" encoding="utf-8"?>
+<w:hdr xmlns:wpc="http://schemas.microsoft.com/office/word/2010/wordprocessingCanvas" xmlns:cx="http://schemas.microsoft.com/office/drawing/2014/chartex" xmlns:cx1="http://schemas.microsoft.com/office/drawing/2015/9/8/chartex" xmlns:cx2="http://schemas.microsoft.com/office/drawing/2015/10/21/chartex" xmlns:cx3="http://schemas.microsoft.com/office/drawing/2016/5/9/chartex" xmlns:cx4="http://schemas.microsoft.com/office/drawing/2016/5/10/chartex" xmlns:cx5="http://schemas.microsoft.com/office/drawing/2016/5/11/chartex" xmlns:cx6="http://schemas.microsoft.com/office/drawing/2016/5/12/chartex" xmlns:cx7="http://schemas.microsoft.com/office/drawing/2016/5/13/chartex" xmlns:cx8="http://schemas.microsoft.com/office/drawing/2016/5/14/chartex" xmlns:mc="http://schemas.openxmlformats.org/markup-compatibility/2006" xmlns:aink="http://schemas.microsoft.com/office/drawing/2016/ink" xmlns:am3d="http://schemas.microsoft.com/office/drawing/2017/model3d" xmlns:o="urn:schemas-microsoft-com:office:office" xmlns:oel="http://schemas.microsoft.com/office/2019/extlst" xmlns:r="http://schemas.openxmlformats.org/officeDocument/2006/relationships" xmlns:m="http://schemas.openxmlformats.org/officeDocument/2006/math" xmlns:v="urn:schemas-microsoft-com:vml" xmlns:wp14="http://schemas.microsoft.com/office/word/2010/wordprocessingDrawing" xmlns:wp="http://schemas.openxmlformats.org/drawingml/2006/wordprocessingDrawing" xmlns:w10="urn:schemas-microsoft-com:office:word" xmlns:w="http://schemas.openxmlformats.org/wordprocessingml/2006/main" xmlns:w14="http://schemas.microsoft.com/office/word/2010/wordml" xmlns:w15="http://schemas.microsoft.com/office/word/2012/wordml" xmlns:w16cex="http://schemas.microsoft.com/office/word/2018/wordml/cex" xmlns:w16cid="http://schemas.microsoft.com/office/word/2016/wordml/cid" xmlns:w16="http://schemas.microsoft.com/office/word/2018/wordml" xmlns:w16du="http://schemas.microsoft.com/office/word/2023/wordml/word16du" xmlns:w16sdtdh="http://schemas.microsoft.com/office/word/2020/wordml/sdtdatahash" xmlns:w16sdtfl="http://schemas.microsoft.com/office/word/2024/wordml/sdtformatlock" xmlns:w16se="http://schemas.microsoft.com/office/word/2015/wordml/symex" xmlns:wpg="http://schemas.microsoft.com/office/word/2010/wordprocessingGroup" xmlns:wpi="http://schemas.microsoft.com/office/word/2010/wordprocessingInk" xmlns:wne="http://schemas.microsoft.com/office/word/2006/wordml" xmlns:wps="http://schemas.microsoft.com/office/word/2010/wordprocessingShape" mc:Ignorable="w14 w15 w16se w16cid w16 w16cex w16sdtdh w16sdtfl w16du wp14">
+  <w:p>
+    <w:pPr>
+      <w:pStyle w:val="Header"/>
+    </w:pPr>
+  </w:p>
+</w:hdr>
+</file>
+
+<file path=word/header2.xml><?xml version="1.0" encoding="utf-8"?>
+<w:hdr xmlns:wpc="http://schemas.microsoft.com/office/word/2010/wordprocessingCanvas" xmlns:cx="http://schemas.microsoft.com/office/drawing/2014/chartex" xmlns:cx1="http://schemas.microsoft.com/office/drawing/2015/9/8/chartex" xmlns:cx2="http://schemas.microsoft.com/office/drawing/2015/10/21/chartex" xmlns:cx3="http://schemas.microsoft.com/office/drawing/2016/5/9/chartex" xmlns:cx4="http://schemas.microsoft.com/office/drawing/2016/5/10/chartex" xmlns:cx5="http://schemas.microsoft.com/office/drawing/2016/5/11/chartex" xmlns:cx6="http://schemas.microsoft.com/office/drawing/2016/5/12/chartex" xmlns:cx7="http://schemas.microsoft.com/office/drawing/2016/5/13/chartex" xmlns:cx8="http://schemas.microsoft.com/office/drawing/2016/5/14/chartex" xmlns:mc="http://schemas.openxmlformats.org/markup-compatibility/2006" xmlns:aink="http://schemas.microsoft.com/office/drawing/2016/ink" xmlns:am3d="http://schemas.microsoft.com/office/drawing/2017/model3d" xmlns:o="urn:schemas-microsoft-com:office:office" xmlns:oel="http://schemas.microsoft.com/office/2019/extlst" xmlns:r="http://schemas.openxmlformats.org/officeDocument/2006/relationships" xmlns:m="http://schemas.openxmlformats.org/officeDocument/2006/math" xmlns:v="urn:schemas-microsoft-com:vml" xmlns:wp14="http://schemas.microsoft.com/office/word/2010/wordprocessingDrawing" xmlns:wp="http://schemas.openxmlformats.org/drawingml/2006/wordprocessingDrawing" xmlns:w10="urn:schemas-microsoft-com:office:word" xmlns:w="http://schemas.openxmlformats.org/wordprocessingml/2006/main" xmlns:w14="http://schemas.microsoft.com/office/word/2010/wordml" xmlns:w15="http://schemas.microsoft.com/office/word/2012/wordml" xmlns:w16cex="http://schemas.microsoft.com/office/word/2018/wordml/cex" xmlns:w16cid="http://schemas.microsoft.com/office/word/2016/wordml/cid" xmlns:w16="http://schemas.microsoft.com/office/word/2018/wordml" xmlns:w16du="http://schemas.microsoft.com/office/word/2023/wordml/word16du" xmlns:w16sdtdh="http://schemas.microsoft.com/office/word/2020/wordml/sdtdatahash" xmlns:w16sdtfl="http://schemas.microsoft.com/office/word/2024/wordml/sdtformatlock" xmlns:w16se="http://schemas.microsoft.com/office/word/2015/wordml/symex" xmlns:wpg="http://schemas.microsoft.com/office/word/2010/wordprocessingGroup" xmlns:wpi="http://schemas.microsoft.com/office/word/2010/wordprocessingInk" xmlns:wne="http://schemas.microsoft.com/office/word/2006/wordml" xmlns:wps="http://schemas.microsoft.com/office/word/2010/wordprocessingShape" mc:Ignorable="w14 w15 w16se w16cid w16 w16cex w16sdtdh w16sdtfl w16du wp14">
+  <w:p>
+    <w:pPr>
+      <w:pStyle w:val="Header"/>
+    </w:pPr>
+    <w:r>
+      <w:rPr>
+        <w:noProof/>
+      </w:rPr>
+      <mc:AlternateContent>
+        <mc:Choice Requires="wps">
+          <w:drawing>
+            <wp:anchor distT="0" distB="0" distL="118745" distR="118745" simplePos="0" relativeHeight="251659264" behindDoc="1" locked="0" layoutInCell="1" allowOverlap="0" wp14:anchorId="5DCFDE61" wp14:editId="0A932242">
+              <wp:simplePos x="0" y="0"/>
+              <wp:positionH relativeFrom="margin">
+                <wp:align>center</wp:align>
+              </wp:positionH>
+              <mc:AlternateContent>
+                <mc:Choice Requires="wp14">
+                  <wp:positionV relativeFrom="page">
+                    <wp14:pctPosVOffset>4500</wp14:pctPosVOffset>
+                  </wp:positionV>
+                </mc:Choice>
+                <mc:Fallback>
+                  <wp:positionV relativeFrom="page">
+                    <wp:posOffset>480695</wp:posOffset>
+                  </wp:positionV>
+                </mc:Fallback>
+              </mc:AlternateContent>
+              <wp:extent cx="5950039" cy="270457"/>
+              <wp:effectExtent l="0" t="0" r="0" b="7620"/>
+              <wp:wrapSquare wrapText="bothSides"/>
+              <wp:docPr id="197" name="Rectangle 200"/>
+              <wp:cNvGraphicFramePr/>
+              <a:graphic xmlns:a="http://schemas.openxmlformats.org/drawingml/2006/main">
+                <a:graphicData uri="http://schemas.microsoft.com/office/word/2010/wordprocessingShape">
+                  <wps:wsp>
+                    <wps:cNvSpPr/>
+                    <wps:spPr>
+                      <a:xfrm>
+                        <a:off x="0" y="0"/>
+                        <a:ext cx="5950039" cy="270457"/>
+                      </a:xfrm>
+                      <a:prstGeom prst="rect">
+                        <a:avLst/>
+                      </a:prstGeom>
+                      <a:solidFill>
+                        <a:schemeClr val="accent1"/>
+                      </a:solidFill>
+                      <a:ln>
+                        <a:noFill/>
+                      </a:ln>
+                    </wps:spPr>
+                    <wps:style>
+                      <a:lnRef idx="2">
+                        <a:schemeClr val="accent1">
+                          <a:shade val="50000"/>
+                        </a:schemeClr>
+                      </a:lnRef>
+                      <a:fillRef idx="1">
+                        <a:schemeClr val="accent1"/>
+                      </a:fillRef>
+                      <a:effectRef idx="0">
+                        <a:schemeClr val="accent1"/>
+                      </a:effectRef>
+                      <a:fontRef idx="minor">
+                        <a:schemeClr val="lt1"/>
+                      </a:fontRef>
+                    </wps:style>
+                    <wps:txbx>
+                      <w:txbxContent>
+                        <w:sdt>
+                          <w:sdtPr>
+                            <w:rPr>
+                              <w:caps/>
+                              <w:color w:val="FFFFFF" w:themeColor="background1"/>
+                            </w:rPr>
+                            <w:alias w:val="Title"/>
+                            <w:tag w:val=""/>
+                            <w:id w:val="1189017394"/>
+                            <w:dataBinding w:prefixMappings="xmlns:ns0='http://purl.org/dc/elements/1.1/' xmlns:ns1='http://schemas.openxmlformats.org/package/2006/metadata/core-properties' " w:xpath="/ns1:coreProperties[1]/ns0:title[1]" w:storeItemID="{6C3C8BC8-F283-45AE-878A-BAB7291924A1}"/>
+                            <w:text/>
+                          </w:sdtPr>
+                          <w:sdtContent>
+                            <w:p>
+                              <w:pPr>
+                                <w:pStyle w:val="Header"/>
+                                <w:jc w:val="center"/>
+                                <w:rPr>
+                                  <w:caps/>
+                                  <w:color w:val="FFFFFF" w:themeColor="background1"/>
+                                </w:rPr>
+                              </w:pPr>
+                              <w:r>
+                                <w:rPr>
+                                  <w:caps/>
+                                  <w:color w:val="FFFFFF" w:themeColor="background1"/>
+                                </w:rPr>
+                                <w:t>CLUB CONSTITUTION</w:t>
+                              </w:r>
+                            </w:p>
+                          </w:sdtContent>
+                        </w:sdt>
+                      </w:txbxContent>
+                    </wps:txbx>
+                    <wps:bodyPr rot="0" spcFirstLastPara="0" vertOverflow="overflow" horzOverflow="overflow" vert="horz" wrap="square" lIns="91440" tIns="45720" rIns="91440" bIns="45720" numCol="1" spcCol="0" rtlCol="0" fromWordArt="0" anchor="ctr" anchorCtr="0" forceAA="0" compatLnSpc="1">
+                      <a:prstTxWarp prst="textNoShape">
+                        <a:avLst/>
+                      </a:prstTxWarp>
+                      <a:spAutoFit/>
+                    </wps:bodyPr>
+                  </wps:wsp>
+                </a:graphicData>
+              </a:graphic>
+              <wp14:sizeRelH relativeFrom="margin">
+                <wp14:pctWidth>100000</wp14:pctWidth>
+              </wp14:sizeRelH>
+              <wp14:sizeRelV relativeFrom="page">
+                <wp14:pctHeight>2700</wp14:pctHeight>
+              </wp14:sizeRelV>
+            </wp:anchor>
+          </w:drawing>
+        </mc:Choice>
+        <mc:Fallback>
+          <w:pict>
+            <v:rect w14:anchorId="5DCFDE61" id="Rectangle 200" o:spid="_x0000_s1026" style="position:absolute;left:0;text-align:left;margin-left:0;margin-top:0;width:468.5pt;height:21.3pt;z-index:-251657216;visibility:visible;mso-wrap-style:square;mso-width-percent:1000;mso-height-percent:27;mso-top-percent:45;mso-wrap-distance-left:9.35pt;mso-wrap-distance-top:0;mso-wrap-distance-right:9.35pt;mso-wrap-distance-bottom:0;mso-position-horizontal:center;mso-position-horizontal-relative:margin;mso-position-vertical-relative:page;mso-width-percent:1000;mso-height-percent:27;mso-top-percent:45;mso-width-relative:margin;mso-height-relative:page;v-text-anchor:middle" o:gfxdata="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" o:allowoverlap="f" fillcolor="#156082 [3204]" stroked="f" strokeweight="1.5pt">
+              <v:textbox style="mso-fit-shape-to-text:t">
+                <w:txbxContent>
+                  <w:sdt>
+                    <w:sdtPr>
+                      <w:rPr>
+                        <w:caps/>
+                        <w:color w:val="FFFFFF" w:themeColor="background1"/>
+                      </w:rPr>
+                      <w:alias w:val="Title"/>
+                      <w:tag w:val=""/>
+                      <w:id w:val="1189017394"/>
+                      <w:dataBinding w:prefixMappings="xmlns:ns0='http://purl.org/dc/elements/1.1/' xmlns:ns1='http://schemas.openxmlformats.org/package/2006/metadata/core-properties' " w:xpath="/ns1:coreProperties[1]/ns0:title[1]" w:storeItemID="{6C3C8BC8-F283-45AE-878A-BAB7291924A1}"/>
+                      <w:text/>
+                    </w:sdtPr>
+                    <w:sdtContent>
+                      <w:p>
+                        <w:pPr>
+                          <w:pStyle w:val="Header"/>
+                          <w:jc w:val="center"/>
+                          <w:rPr>
+                            <w:caps/>
+                            <w:color w:val="FFFFFF" w:themeColor="background1"/>
+                          </w:rPr>
+                        </w:pPr>
+                        <w:r>
+                          <w:rPr>
+                            <w:caps/>
+                            <w:color w:val="FFFFFF" w:themeColor="background1"/>
+                          </w:rPr>
+                          <w:t>CLUB CONSTITUTION</w:t>
+                        </w:r>
+                      </w:p>
+                    </w:sdtContent>
+                  </w:sdt>
+                </w:txbxContent>
+              </v:textbox>
+              <w10:wrap type="square" anchorx="margin" anchory="page"/>
+            </v:rect>
+          </w:pict>
+        </mc:Fallback>
+      </mc:AlternateContent>
+    </w:r>
+  </w:p>
+</w:hdr>
+</file>
+
+<file path=word/header3.xml><?xml version="1.0" encoding="utf-8"?>
+<w:hdr xmlns:wpc="http://schemas.microsoft.com/office/word/2010/wordprocessingCanvas" xmlns:cx="http://schemas.microsoft.com/office/drawing/2014/chartex" xmlns:cx1="http://schemas.microsoft.com/office/drawing/2015/9/8/chartex" xmlns:cx2="http://schemas.microsoft.com/office/drawing/2015/10/21/chartex" xmlns:cx3="http://schemas.microsoft.com/office/drawing/2016/5/9/chartex" xmlns:cx4="http://schemas.microsoft.com/office/drawing/2016/5/10/chartex" xmlns:cx5="http://schemas.microsoft.com/office/drawing/2016/5/11/chartex" xmlns:cx6="http://schemas.microsoft.com/office/drawing/2016/5/12/chartex" xmlns:cx7="http://schemas.microsoft.com/office/drawing/2016/5/13/chartex" xmlns:cx8="http://schemas.microsoft.com/office/drawing/2016/5/14/chartex" xmlns:mc="http://schemas.openxmlformats.org/markup-compatibility/2006" xmlns:aink="http://schemas.microsoft.com/office/drawing/2016/ink" xmlns:am3d="http://schemas.microsoft.com/office/drawing/2017/model3d" xmlns:o="urn:schemas-microsoft-com:office:office" xmlns:oel="http://schemas.microsoft.com/office/2019/extlst" xmlns:r="http://schemas.openxmlformats.org/officeDocument/2006/relationships" xmlns:m="http://schemas.openxmlformats.org/officeDocument/2006/math" xmlns:v="urn:schemas-microsoft-com:vml" xmlns:wp14="http://schemas.microsoft.com/office/word/2010/wordprocessingDrawing" xmlns:wp="http://schemas.openxmlformats.org/drawingml/2006/wordprocessingDrawing" xmlns:w10="urn:schemas-microsoft-com:office:word" xmlns:w="http://schemas.openxmlformats.org/wordprocessingml/2006/main" xmlns:w14="http://schemas.microsoft.com/office/word/2010/wordml" xmlns:w15="http://schemas.microsoft.com/office/word/2012/wordml" xmlns:w16cex="http://schemas.microsoft.com/office/word/2018/wordml/cex" xmlns:w16cid="http://schemas.microsoft.com/office/word/2016/wordml/cid" xmlns:w16="http://schemas.microsoft.com/office/word/2018/wordml" xmlns:w16du="http://schemas.microsoft.com/office/word/2023/wordml/word16du" xmlns:w16sdtdh="http://schemas.microsoft.com/office/word/2020/wordml/sdtdatahash" xmlns:w16sdtfl="http://schemas.microsoft.com/office/word/2024/wordml/sdtformatlock" xmlns:w16se="http://schemas.microsoft.com/office/word/2015/wordml/symex" xmlns:wpg="http://schemas.microsoft.com/office/word/2010/wordprocessingGroup" xmlns:wpi="http://schemas.microsoft.com/office/word/2010/wordprocessingInk" xmlns:wne="http://schemas.microsoft.com/office/word/2006/wordml" xmlns:wps="http://schemas.microsoft.com/office/word/2010/wordprocessingShape" mc:Ignorable="w14 w15 w16se w16cid w16 w16cex w16sdtdh w16sdtfl w16du wp14">
+  <w:p>
+    <w:pPr>
+      <w:pStyle w:val="Header"/>
+    </w:pPr>
+  </w:p>
+</w:hdr>
 </file>
 
 <file path=word/styles.xml><?xml version="1.0" encoding="utf-8"?>
@@ -2280,7 +3378,6 @@
   <w:style w:type="character" w:default="1" w:styleId="DefaultParagraphFont">
     <w:name w:val="Default Paragraph Font"/>
     <w:uiPriority w:val="1"/>
-    <w:semiHidden/>
     <w:unhideWhenUsed/>
   </w:style>
   <w:style w:type="table" w:default="1" w:styleId="TableNormal">
@@ -2322,6 +3419,134 @@
       <w:b/>
       <w:color w:val="009B8F"/>
       <w:sz w:val="52"/>
+    </w:rPr>
+  </w:style>
+  <w:style w:type="table" w:styleId="GridTable4-Accent4">
+    <w:name w:val="Grid Table 4 Accent 4"/>
+    <w:basedOn w:val="TableNormal"/>
+    <w:uiPriority w:val="49"/>
+    <w:rsid w:val="008417E4"/>
+    <w:pPr>
+      <w:spacing w:after="0" w:line="240" w:lineRule="auto"/>
+    </w:pPr>
+    <w:tblPr>
+      <w:tblStyleRowBandSize w:val="1"/>
+      <w:tblStyleColBandSize w:val="1"/>
+      <w:tblBorders>
+        <w:top w:val="single" w:sz="4" w:space="0" w:color="60CAF3" w:themeColor="accent4" w:themeTint="99"/>
+        <w:left w:val="single" w:sz="4" w:space="0" w:color="60CAF3" w:themeColor="accent4" w:themeTint="99"/>
+        <w:bottom w:val="single" w:sz="4" w:space="0" w:color="60CAF3" w:themeColor="accent4" w:themeTint="99"/>
+        <w:right w:val="single" w:sz="4" w:space="0" w:color="60CAF3" w:themeColor="accent4" w:themeTint="99"/>
+        <w:insideH w:val="single" w:sz="4" w:space="0" w:color="60CAF3" w:themeColor="accent4" w:themeTint="99"/>
+        <w:insideV w:val="single" w:sz="4" w:space="0" w:color="60CAF3" w:themeColor="accent4" w:themeTint="99"/>
+      </w:tblBorders>
+    </w:tblPr>
+    <w:tblStylePr w:type="firstRow">
+      <w:rPr>
+        <w:b/>
+        <w:bCs/>
+        <w:color w:val="FFFFFF" w:themeColor="background1"/>
+      </w:rPr>
+      <w:tblPr/>
+      <w:tcPr>
+        <w:tcBorders>
+          <w:top w:val="single" w:sz="4" w:space="0" w:color="0F9ED5" w:themeColor="accent4"/>
+          <w:left w:val="single" w:sz="4" w:space="0" w:color="0F9ED5" w:themeColor="accent4"/>
+          <w:bottom w:val="single" w:sz="4" w:space="0" w:color="0F9ED5" w:themeColor="accent4"/>
+          <w:right w:val="single" w:sz="4" w:space="0" w:color="0F9ED5" w:themeColor="accent4"/>
+          <w:insideH w:val="nil"/>
+          <w:insideV w:val="nil"/>
+        </w:tcBorders>
+        <w:shd w:val="clear" w:color="auto" w:fill="0F9ED5" w:themeFill="accent4"/>
+      </w:tcPr>
+    </w:tblStylePr>
+    <w:tblStylePr w:type="lastRow">
+      <w:rPr>
+        <w:b/>
+        <w:bCs/>
+      </w:rPr>
+      <w:tblPr/>
+      <w:tcPr>
+        <w:tcBorders>
+          <w:top w:val="double" w:sz="4" w:space="0" w:color="0F9ED5" w:themeColor="accent4"/>
+        </w:tcBorders>
+      </w:tcPr>
+    </w:tblStylePr>
+    <w:tblStylePr w:type="firstCol">
+      <w:rPr>
+        <w:b/>
+        <w:bCs/>
+      </w:rPr>
+    </w:tblStylePr>
+    <w:tblStylePr w:type="lastCol">
+      <w:rPr>
+        <w:b/>
+        <w:bCs/>
+      </w:rPr>
+    </w:tblStylePr>
+    <w:tblStylePr w:type="band1Vert">
+      <w:tblPr/>
+      <w:tcPr>
+        <w:shd w:val="clear" w:color="auto" w:fill="CAEDFB" w:themeFill="accent4" w:themeFillTint="33"/>
+      </w:tcPr>
+    </w:tblStylePr>
+    <w:tblStylePr w:type="band1Horz">
+      <w:tblPr/>
+      <w:tcPr>
+        <w:shd w:val="clear" w:color="auto" w:fill="CAEDFB" w:themeFill="accent4" w:themeFillTint="33"/>
+      </w:tcPr>
+    </w:tblStylePr>
+  </w:style>
+  <w:style w:type="paragraph" w:styleId="Header">
+    <w:name w:val="header"/>
+    <w:basedOn w:val="Normal"/>
+    <w:link w:val="HeaderChar"/>
+    <w:uiPriority w:val="99"/>
+    <w:unhideWhenUsed/>
+    <w:rsid w:val="000274EE"/>
+    <w:pPr>
+      <w:tabs>
+        <w:tab w:val="center" w:pos="4513"/>
+        <w:tab w:val="right" w:pos="9026"/>
+      </w:tabs>
+      <w:spacing w:line="240" w:lineRule="auto"/>
+    </w:pPr>
+  </w:style>
+  <w:style w:type="character" w:customStyle="1" w:styleId="HeaderChar">
+    <w:name w:val="Header Char"/>
+    <w:basedOn w:val="DefaultParagraphFont"/>
+    <w:link w:val="Header"/>
+    <w:uiPriority w:val="99"/>
+    <w:rsid w:val="000274EE"/>
+    <w:rPr>
+      <w:rFonts w:ascii="Verdana" w:eastAsia="Verdana" w:hAnsi="Verdana" w:cs="Verdana"/>
+      <w:color w:val="000000"/>
+    </w:rPr>
+  </w:style>
+  <w:style w:type="paragraph" w:styleId="Footer">
+    <w:name w:val="footer"/>
+    <w:basedOn w:val="Normal"/>
+    <w:link w:val="FooterChar"/>
+    <w:uiPriority w:val="99"/>
+    <w:unhideWhenUsed/>
+    <w:rsid w:val="000274EE"/>
+    <w:pPr>
+      <w:tabs>
+        <w:tab w:val="center" w:pos="4513"/>
+        <w:tab w:val="right" w:pos="9026"/>
+      </w:tabs>
+      <w:spacing w:line="240" w:lineRule="auto"/>
+    </w:pPr>
+  </w:style>
+  <w:style w:type="character" w:customStyle="1" w:styleId="FooterChar">
+    <w:name w:val="Footer Char"/>
+    <w:basedOn w:val="DefaultParagraphFont"/>
+    <w:link w:val="Footer"/>
+    <w:uiPriority w:val="99"/>
+    <w:rsid w:val="000274EE"/>
+    <w:rPr>
+      <w:rFonts w:ascii="Verdana" w:eastAsia="Verdana" w:hAnsi="Verdana" w:cs="Verdana"/>
+      <w:color w:val="000000"/>
     </w:rPr>
   </w:style>
 </w:styles>
@@ -2640,4 +3865,16 @@
     </a:ext>
   </a:extLst>
 </a:theme>
+</file>
+
+<file path=customXml/item1.xml><?xml version="1.0" encoding="utf-8"?>
+<b:Sources xmlns:b="http://schemas.openxmlformats.org/officeDocument/2006/bibliography" xmlns="http://schemas.openxmlformats.org/officeDocument/2006/bibliography" SelectedStyle="\APASixthEditionOfficeOnline.xsl" StyleName="APA" Version="6"/>
+</file>
+
+<file path=customXml/itemProps1.xml><?xml version="1.0" encoding="utf-8"?>
+<ds:datastoreItem xmlns:ds="http://schemas.openxmlformats.org/officeDocument/2006/customXml" ds:itemID="{12C5B029-8EBE-4A33-AB9A-5D7118F23BC9}">
+  <ds:schemaRefs>
+    <ds:schemaRef ds:uri="http://schemas.openxmlformats.org/officeDocument/2006/bibliography"/>
+  </ds:schemaRefs>
+</ds:datastoreItem>
 </file>
</xml_diff>